<commit_message>
docs: actualizar documento final y diagramas corregidos
</commit_message>
<xml_diff>
--- a/Alonzo_Darlin_actividad1.docx
+++ b/Alonzo_Darlin_actividad1.docx
@@ -1821,14 +1821,27 @@
       <w:r>
         <w:t xml:space="preserve">Ilustración </w:t>
       </w:r>
-      <w:fldSimple w:instr=" SEQ Ilustración \* ARABIC ">
-        <w:r>
-          <w:rPr>
-            <w:noProof/>
-          </w:rPr>
-          <w:t>1</w:t>
-        </w:r>
-      </w:fldSimple>
+      <w:r>
+        <w:fldChar w:fldCharType="begin"/>
+      </w:r>
+      <w:r>
+        <w:instrText xml:space="preserve"> SEQ Ilustración \* ARABIC </w:instrText>
+      </w:r>
+      <w:r>
+        <w:fldChar w:fldCharType="separate"/>
+      </w:r>
+      <w:r>
+        <w:rPr>
+          <w:noProof/>
+        </w:rPr>
+        <w:t>1</w:t>
+      </w:r>
+      <w:r>
+        <w:rPr>
+          <w:noProof/>
+        </w:rPr>
+        <w:fldChar w:fldCharType="end"/>
+      </w:r>
       <w:r>
         <w:t>: Diagrama de casos de uso</w:t>
       </w:r>
@@ -1898,17 +1911,102 @@
       <w:r>
         <w:t xml:space="preserve">Ilustración </w:t>
       </w:r>
-      <w:fldSimple w:instr=" SEQ Ilustración \* ARABIC ">
-        <w:r>
-          <w:rPr>
-            <w:noProof/>
-          </w:rPr>
-          <w:t>2</w:t>
-        </w:r>
-      </w:fldSimple>
+      <w:r>
+        <w:fldChar w:fldCharType="begin"/>
+      </w:r>
+      <w:r>
+        <w:instrText xml:space="preserve"> SEQ Ilustración \* ARABIC </w:instrText>
+      </w:r>
+      <w:r>
+        <w:fldChar w:fldCharType="separate"/>
+      </w:r>
+      <w:r>
+        <w:rPr>
+          <w:noProof/>
+        </w:rPr>
+        <w:t>2</w:t>
+      </w:r>
+      <w:r>
+        <w:rPr>
+          <w:noProof/>
+        </w:rPr>
+        <w:fldChar w:fldCharType="end"/>
+      </w:r>
       <w:r>
         <w:t>: Diagrama de clases UML</w:t>
       </w:r>
+    </w:p>
+    <w:p>
+      <w:pPr>
+        <w:pStyle w:val="Prrafodelista"/>
+        <w:widowControl w:val="0"/>
+        <w:pBdr>
+          <w:top w:val="nil"/>
+          <w:left w:val="nil"/>
+          <w:bottom w:val="nil"/>
+          <w:right w:val="nil"/>
+          <w:between w:val="nil"/>
+        </w:pBdr>
+        <w:spacing w:after="0" w:line="360" w:lineRule="auto"/>
+        <w:ind w:left="360"/>
+        <w:jc w:val="both"/>
+        <w:rPr>
+          <w:rFonts w:ascii="Arial" w:hAnsi="Arial" w:cs="Arial"/>
+          <w:b/>
+          <w:bCs/>
+          <w:sz w:val="24"/>
+          <w:szCs w:val="24"/>
+          <w:lang w:eastAsia="es-EC"/>
+        </w:rPr>
+      </w:pPr>
+    </w:p>
+    <w:p>
+      <w:pPr>
+        <w:pStyle w:val="Prrafodelista"/>
+        <w:widowControl w:val="0"/>
+        <w:pBdr>
+          <w:top w:val="nil"/>
+          <w:left w:val="nil"/>
+          <w:bottom w:val="nil"/>
+          <w:right w:val="nil"/>
+          <w:between w:val="nil"/>
+        </w:pBdr>
+        <w:spacing w:after="0" w:line="360" w:lineRule="auto"/>
+        <w:ind w:left="360"/>
+        <w:jc w:val="both"/>
+        <w:rPr>
+          <w:rFonts w:ascii="Arial" w:hAnsi="Arial" w:cs="Arial"/>
+          <w:b/>
+          <w:bCs/>
+          <w:sz w:val="24"/>
+          <w:szCs w:val="24"/>
+          <w:lang w:eastAsia="es-EC"/>
+        </w:rPr>
+      </w:pPr>
+    </w:p>
+    <w:p>
+      <w:pPr>
+        <w:pStyle w:val="Prrafodelista"/>
+        <w:widowControl w:val="0"/>
+        <w:pBdr>
+          <w:top w:val="nil"/>
+          <w:left w:val="nil"/>
+          <w:bottom w:val="nil"/>
+          <w:right w:val="nil"/>
+          <w:between w:val="nil"/>
+        </w:pBdr>
+        <w:spacing w:after="0" w:line="360" w:lineRule="auto"/>
+        <w:ind w:left="360"/>
+        <w:jc w:val="both"/>
+        <w:rPr>
+          <w:rFonts w:ascii="Arial" w:hAnsi="Arial" w:cs="Arial"/>
+          <w:b/>
+          <w:bCs/>
+          <w:sz w:val="24"/>
+          <w:szCs w:val="24"/>
+          <w:lang w:eastAsia="es-EC"/>
+        </w:rPr>
+      </w:pPr>
     </w:p>
     <w:p>
       <w:pPr>
@@ -1945,6 +2043,7 @@
           <w:szCs w:val="24"/>
           <w:lang w:eastAsia="es-EC"/>
         </w:rPr>
+        <w:lastRenderedPageBreak/>
         <w:t xml:space="preserve">Patrones de diseño (Explicación técnica y diagramas – código conceptual de Factory </w:t>
       </w:r>
       <w:proofErr w:type="spellStart"/>
@@ -2127,17 +2226,7 @@
                 <w:szCs w:val="24"/>
                 <w:lang w:eastAsia="es-EC"/>
               </w:rPr>
-              <w:t xml:space="preserve">Propósito en el </w:t>
-            </w:r>
-            <w:r>
-              <w:rPr>
-                <w:rFonts w:ascii="Arial" w:hAnsi="Arial" w:cs="Arial"/>
-                <w:sz w:val="24"/>
-                <w:szCs w:val="24"/>
-                <w:lang w:eastAsia="es-EC"/>
-              </w:rPr>
-              <w:lastRenderedPageBreak/>
-              <w:t>sistema</w:t>
+              <w:t>Propósito en el sistema</w:t>
             </w:r>
           </w:p>
         </w:tc>
@@ -2168,18 +2257,7 @@
                 <w:szCs w:val="24"/>
                 <w:lang w:eastAsia="es-EC"/>
               </w:rPr>
-              <w:lastRenderedPageBreak/>
-              <w:t xml:space="preserve">Justificación </w:t>
-            </w:r>
-            <w:r>
-              <w:rPr>
-                <w:rFonts w:ascii="Arial" w:hAnsi="Arial" w:cs="Arial"/>
-                <w:sz w:val="24"/>
-                <w:szCs w:val="24"/>
-                <w:lang w:eastAsia="es-EC"/>
-              </w:rPr>
-              <w:lastRenderedPageBreak/>
-              <w:t>técnica</w:t>
+              <w:t>Justificación técnica</w:t>
             </w:r>
           </w:p>
         </w:tc>
@@ -2218,7 +2296,6 @@
                 <w:szCs w:val="24"/>
                 <w:lang w:eastAsia="es-EC"/>
               </w:rPr>
-              <w:lastRenderedPageBreak/>
               <w:t xml:space="preserve">Factory </w:t>
             </w:r>
             <w:proofErr w:type="spellStart"/>
@@ -2931,7 +3008,6 @@
     </w:tbl>
     <w:p>
       <w:pPr>
-        <w:pStyle w:val="Prrafodelista"/>
         <w:widowControl w:val="0"/>
         <w:pBdr>
           <w:top w:val="nil"/>
@@ -2941,79 +3017,6 @@
           <w:between w:val="nil"/>
         </w:pBdr>
         <w:spacing w:after="0" w:line="360" w:lineRule="auto"/>
-        <w:ind w:left="360"/>
-        <w:jc w:val="both"/>
-        <w:rPr>
-          <w:rFonts w:ascii="Arial" w:hAnsi="Arial" w:cs="Arial"/>
-          <w:b/>
-          <w:bCs/>
-          <w:sz w:val="24"/>
-          <w:szCs w:val="24"/>
-          <w:lang w:eastAsia="es-EC"/>
-        </w:rPr>
-      </w:pPr>
-    </w:p>
-    <w:p>
-      <w:pPr>
-        <w:pStyle w:val="Prrafodelista"/>
-        <w:widowControl w:val="0"/>
-        <w:pBdr>
-          <w:top w:val="nil"/>
-          <w:left w:val="nil"/>
-          <w:bottom w:val="nil"/>
-          <w:right w:val="nil"/>
-          <w:between w:val="nil"/>
-        </w:pBdr>
-        <w:spacing w:after="0" w:line="360" w:lineRule="auto"/>
-        <w:ind w:left="360"/>
-        <w:jc w:val="both"/>
-        <w:rPr>
-          <w:rFonts w:ascii="Arial" w:hAnsi="Arial" w:cs="Arial"/>
-          <w:b/>
-          <w:bCs/>
-          <w:sz w:val="24"/>
-          <w:szCs w:val="24"/>
-          <w:lang w:eastAsia="es-EC"/>
-        </w:rPr>
-      </w:pPr>
-    </w:p>
-    <w:p>
-      <w:pPr>
-        <w:pStyle w:val="Prrafodelista"/>
-        <w:widowControl w:val="0"/>
-        <w:pBdr>
-          <w:top w:val="nil"/>
-          <w:left w:val="nil"/>
-          <w:bottom w:val="nil"/>
-          <w:right w:val="nil"/>
-          <w:between w:val="nil"/>
-        </w:pBdr>
-        <w:spacing w:after="0" w:line="360" w:lineRule="auto"/>
-        <w:ind w:left="360"/>
-        <w:jc w:val="both"/>
-        <w:rPr>
-          <w:rFonts w:ascii="Arial" w:hAnsi="Arial" w:cs="Arial"/>
-          <w:b/>
-          <w:bCs/>
-          <w:sz w:val="24"/>
-          <w:szCs w:val="24"/>
-          <w:lang w:eastAsia="es-EC"/>
-        </w:rPr>
-      </w:pPr>
-    </w:p>
-    <w:p>
-      <w:pPr>
-        <w:pStyle w:val="Prrafodelista"/>
-        <w:widowControl w:val="0"/>
-        <w:pBdr>
-          <w:top w:val="nil"/>
-          <w:left w:val="nil"/>
-          <w:bottom w:val="nil"/>
-          <w:right w:val="nil"/>
-          <w:between w:val="nil"/>
-        </w:pBdr>
-        <w:spacing w:after="0" w:line="360" w:lineRule="auto"/>
-        <w:ind w:left="360"/>
         <w:jc w:val="both"/>
         <w:rPr>
           <w:rFonts w:ascii="Arial" w:hAnsi="Arial" w:cs="Arial"/>
@@ -3147,14 +3150,27 @@
       <w:r>
         <w:t xml:space="preserve">Ilustración </w:t>
       </w:r>
-      <w:fldSimple w:instr=" SEQ Ilustración \* ARABIC ">
-        <w:r>
-          <w:rPr>
-            <w:noProof/>
-          </w:rPr>
-          <w:t>3</w:t>
-        </w:r>
-      </w:fldSimple>
+      <w:r>
+        <w:fldChar w:fldCharType="begin"/>
+      </w:r>
+      <w:r>
+        <w:instrText xml:space="preserve"> SEQ Ilustración \* ARABIC </w:instrText>
+      </w:r>
+      <w:r>
+        <w:fldChar w:fldCharType="separate"/>
+      </w:r>
+      <w:r>
+        <w:rPr>
+          <w:noProof/>
+        </w:rPr>
+        <w:t>3</w:t>
+      </w:r>
+      <w:r>
+        <w:rPr>
+          <w:noProof/>
+        </w:rPr>
+        <w:fldChar w:fldCharType="end"/>
+      </w:r>
       <w:r>
         <w:t xml:space="preserve">: Flujo cuando se registra un nuevo caso de rescate, evidenciando la participación </w:t>
       </w:r>
@@ -3288,6 +3304,495 @@
           <w:lang w:eastAsia="es-EC"/>
         </w:rPr>
       </w:pPr>
+      <w:r>
+        <w:rPr>
+          <w:rFonts w:ascii="Arial" w:hAnsi="Arial" w:cs="Arial"/>
+          <w:sz w:val="24"/>
+          <w:szCs w:val="24"/>
+          <w:lang w:eastAsia="es-EC"/>
+        </w:rPr>
+        <w:t xml:space="preserve">Para garantizar la trazabilidad, orden y mantenibilidad en la arquitectura lógica del sistema, se adoptó la metodología de trabajo </w:t>
+      </w:r>
+      <w:proofErr w:type="spellStart"/>
+      <w:r>
+        <w:rPr>
+          <w:rFonts w:ascii="Arial" w:hAnsi="Arial" w:cs="Arial"/>
+          <w:sz w:val="24"/>
+          <w:szCs w:val="24"/>
+          <w:lang w:eastAsia="es-EC"/>
+        </w:rPr>
+        <w:t>Gitflow</w:t>
+      </w:r>
+      <w:proofErr w:type="spellEnd"/>
+      <w:r>
+        <w:rPr>
+          <w:rFonts w:ascii="Arial" w:hAnsi="Arial" w:cs="Arial"/>
+          <w:sz w:val="24"/>
+          <w:szCs w:val="24"/>
+          <w:lang w:eastAsia="es-EC"/>
+        </w:rPr>
+        <w:t xml:space="preserve">. Este modelo de ramificación es ideal para proyectos que requieren un flujo estricto de integración continua y control sobre versiones estables e </w:t>
+      </w:r>
+      <w:proofErr w:type="spellStart"/>
+      <w:r>
+        <w:rPr>
+          <w:rFonts w:ascii="Arial" w:hAnsi="Arial" w:cs="Arial"/>
+          <w:sz w:val="24"/>
+          <w:szCs w:val="24"/>
+          <w:lang w:eastAsia="es-EC"/>
+        </w:rPr>
+        <w:t>interim</w:t>
+      </w:r>
+      <w:proofErr w:type="spellEnd"/>
+      <w:r>
+        <w:rPr>
+          <w:rFonts w:ascii="Arial" w:hAnsi="Arial" w:cs="Arial"/>
+          <w:sz w:val="24"/>
+          <w:szCs w:val="24"/>
+          <w:lang w:eastAsia="es-EC"/>
+        </w:rPr>
+        <w:t>:</w:t>
+      </w:r>
+    </w:p>
+    <w:p>
+      <w:pPr>
+        <w:pStyle w:val="Prrafodelista"/>
+        <w:widowControl w:val="0"/>
+        <w:numPr>
+          <w:ilvl w:val="0"/>
+          <w:numId w:val="24"/>
+        </w:numPr>
+        <w:pBdr>
+          <w:top w:val="nil"/>
+          <w:left w:val="nil"/>
+          <w:bottom w:val="nil"/>
+          <w:right w:val="nil"/>
+          <w:between w:val="nil"/>
+        </w:pBdr>
+        <w:spacing w:after="0" w:line="360" w:lineRule="auto"/>
+        <w:jc w:val="both"/>
+        <w:rPr>
+          <w:rFonts w:ascii="Arial" w:hAnsi="Arial" w:cs="Arial"/>
+          <w:sz w:val="24"/>
+          <w:szCs w:val="24"/>
+          <w:lang w:eastAsia="es-EC"/>
+        </w:rPr>
+      </w:pPr>
+      <w:proofErr w:type="spellStart"/>
+      <w:r>
+        <w:rPr>
+          <w:rFonts w:ascii="Arial" w:hAnsi="Arial" w:cs="Arial"/>
+          <w:sz w:val="24"/>
+          <w:szCs w:val="24"/>
+          <w:lang w:eastAsia="es-EC"/>
+        </w:rPr>
+        <w:t>main</w:t>
+      </w:r>
+      <w:proofErr w:type="spellEnd"/>
+      <w:r>
+        <w:rPr>
+          <w:rFonts w:ascii="Arial" w:hAnsi="Arial" w:cs="Arial"/>
+          <w:sz w:val="24"/>
+          <w:szCs w:val="24"/>
+          <w:lang w:eastAsia="es-EC"/>
+        </w:rPr>
+        <w:t xml:space="preserve"> / master: Contiene la versión de producción estable y la documentación final lista para entrega.</w:t>
+      </w:r>
+    </w:p>
+    <w:p>
+      <w:pPr>
+        <w:pStyle w:val="Prrafodelista"/>
+        <w:widowControl w:val="0"/>
+        <w:numPr>
+          <w:ilvl w:val="0"/>
+          <w:numId w:val="24"/>
+        </w:numPr>
+        <w:pBdr>
+          <w:top w:val="nil"/>
+          <w:left w:val="nil"/>
+          <w:bottom w:val="nil"/>
+          <w:right w:val="nil"/>
+          <w:between w:val="nil"/>
+        </w:pBdr>
+        <w:spacing w:after="0" w:line="360" w:lineRule="auto"/>
+        <w:jc w:val="both"/>
+        <w:rPr>
+          <w:rFonts w:ascii="Arial" w:hAnsi="Arial" w:cs="Arial"/>
+          <w:sz w:val="24"/>
+          <w:szCs w:val="24"/>
+          <w:lang w:eastAsia="es-EC"/>
+        </w:rPr>
+      </w:pPr>
+      <w:proofErr w:type="spellStart"/>
+      <w:r>
+        <w:rPr>
+          <w:rFonts w:ascii="Arial" w:hAnsi="Arial" w:cs="Arial"/>
+          <w:sz w:val="24"/>
+          <w:szCs w:val="24"/>
+          <w:lang w:eastAsia="es-EC"/>
+        </w:rPr>
+        <w:t>develop</w:t>
+      </w:r>
+      <w:proofErr w:type="spellEnd"/>
+      <w:r>
+        <w:rPr>
+          <w:rFonts w:ascii="Arial" w:hAnsi="Arial" w:cs="Arial"/>
+          <w:sz w:val="24"/>
+          <w:szCs w:val="24"/>
+          <w:lang w:eastAsia="es-EC"/>
+        </w:rPr>
+        <w:t>: Funciona como la rama central de integración continua donde se consolidan todos los avances validados de la arquitectura lógica.</w:t>
+      </w:r>
+    </w:p>
+    <w:p>
+      <w:pPr>
+        <w:pStyle w:val="Prrafodelista"/>
+        <w:widowControl w:val="0"/>
+        <w:numPr>
+          <w:ilvl w:val="0"/>
+          <w:numId w:val="24"/>
+        </w:numPr>
+        <w:pBdr>
+          <w:top w:val="nil"/>
+          <w:left w:val="nil"/>
+          <w:bottom w:val="nil"/>
+          <w:right w:val="nil"/>
+          <w:between w:val="nil"/>
+        </w:pBdr>
+        <w:spacing w:after="0" w:line="360" w:lineRule="auto"/>
+        <w:jc w:val="both"/>
+        <w:rPr>
+          <w:rFonts w:ascii="Arial" w:hAnsi="Arial" w:cs="Arial"/>
+          <w:sz w:val="24"/>
+          <w:szCs w:val="24"/>
+          <w:lang w:eastAsia="es-EC"/>
+        </w:rPr>
+      </w:pPr>
+      <w:r>
+        <w:rPr>
+          <w:rFonts w:ascii="Arial" w:hAnsi="Arial" w:cs="Arial"/>
+          <w:sz w:val="24"/>
+          <w:szCs w:val="24"/>
+          <w:lang w:eastAsia="es-EC"/>
+        </w:rPr>
+        <w:t xml:space="preserve">Ramas </w:t>
+      </w:r>
+      <w:proofErr w:type="spellStart"/>
+      <w:r>
+        <w:rPr>
+          <w:rFonts w:ascii="Arial" w:hAnsi="Arial" w:cs="Arial"/>
+          <w:sz w:val="24"/>
+          <w:szCs w:val="24"/>
+          <w:lang w:eastAsia="es-EC"/>
+        </w:rPr>
+        <w:t>feature</w:t>
+      </w:r>
+      <w:proofErr w:type="spellEnd"/>
+      <w:r>
+        <w:rPr>
+          <w:rFonts w:ascii="Arial" w:hAnsi="Arial" w:cs="Arial"/>
+          <w:sz w:val="24"/>
+          <w:szCs w:val="24"/>
+          <w:lang w:eastAsia="es-EC"/>
+        </w:rPr>
+        <w:t>/*: Ramas secundarias de vida corta creadas exclusivamente para el modelado y diseño de componentes específicos sin alterar la rama principal de desarrollo:</w:t>
+      </w:r>
+    </w:p>
+    <w:p>
+      <w:pPr>
+        <w:pStyle w:val="Prrafodelista"/>
+        <w:widowControl w:val="0"/>
+        <w:numPr>
+          <w:ilvl w:val="0"/>
+          <w:numId w:val="25"/>
+        </w:numPr>
+        <w:pBdr>
+          <w:top w:val="nil"/>
+          <w:left w:val="nil"/>
+          <w:bottom w:val="nil"/>
+          <w:right w:val="nil"/>
+          <w:between w:val="nil"/>
+        </w:pBdr>
+        <w:spacing w:after="0" w:line="360" w:lineRule="auto"/>
+        <w:jc w:val="both"/>
+        <w:rPr>
+          <w:rFonts w:ascii="Arial" w:hAnsi="Arial" w:cs="Arial"/>
+          <w:sz w:val="24"/>
+          <w:szCs w:val="24"/>
+          <w:lang w:eastAsia="es-EC"/>
+        </w:rPr>
+      </w:pPr>
+      <w:proofErr w:type="spellStart"/>
+      <w:r>
+        <w:rPr>
+          <w:rFonts w:ascii="Arial" w:hAnsi="Arial" w:cs="Arial"/>
+          <w:sz w:val="24"/>
+          <w:szCs w:val="24"/>
+          <w:lang w:eastAsia="es-EC"/>
+        </w:rPr>
+        <w:t>feature</w:t>
+      </w:r>
+      <w:proofErr w:type="spellEnd"/>
+      <w:r>
+        <w:rPr>
+          <w:rFonts w:ascii="Arial" w:hAnsi="Arial" w:cs="Arial"/>
+          <w:sz w:val="24"/>
+          <w:szCs w:val="24"/>
+          <w:lang w:eastAsia="es-EC"/>
+        </w:rPr>
+        <w:t>/</w:t>
+      </w:r>
+      <w:proofErr w:type="spellStart"/>
+      <w:r>
+        <w:rPr>
+          <w:rFonts w:ascii="Arial" w:hAnsi="Arial" w:cs="Arial"/>
+          <w:sz w:val="24"/>
+          <w:szCs w:val="24"/>
+          <w:lang w:eastAsia="es-EC"/>
+        </w:rPr>
+        <w:t>analisis</w:t>
+      </w:r>
+      <w:proofErr w:type="spellEnd"/>
+      <w:r>
+        <w:rPr>
+          <w:rFonts w:ascii="Arial" w:hAnsi="Arial" w:cs="Arial"/>
+          <w:sz w:val="24"/>
+          <w:szCs w:val="24"/>
+          <w:lang w:eastAsia="es-EC"/>
+        </w:rPr>
+        <w:t>-requisitos: Casos de uso y especificación de actores.</w:t>
+      </w:r>
+    </w:p>
+    <w:p>
+      <w:pPr>
+        <w:pStyle w:val="Prrafodelista"/>
+        <w:widowControl w:val="0"/>
+        <w:numPr>
+          <w:ilvl w:val="0"/>
+          <w:numId w:val="25"/>
+        </w:numPr>
+        <w:pBdr>
+          <w:top w:val="nil"/>
+          <w:left w:val="nil"/>
+          <w:bottom w:val="nil"/>
+          <w:right w:val="nil"/>
+          <w:between w:val="nil"/>
+        </w:pBdr>
+        <w:spacing w:after="0" w:line="360" w:lineRule="auto"/>
+        <w:jc w:val="both"/>
+        <w:rPr>
+          <w:rFonts w:ascii="Arial" w:hAnsi="Arial" w:cs="Arial"/>
+          <w:sz w:val="24"/>
+          <w:szCs w:val="24"/>
+          <w:lang w:eastAsia="es-EC"/>
+        </w:rPr>
+      </w:pPr>
+      <w:proofErr w:type="spellStart"/>
+      <w:r>
+        <w:rPr>
+          <w:rFonts w:ascii="Arial" w:hAnsi="Arial" w:cs="Arial"/>
+          <w:sz w:val="24"/>
+          <w:szCs w:val="24"/>
+          <w:lang w:eastAsia="es-EC"/>
+        </w:rPr>
+        <w:t>feature</w:t>
+      </w:r>
+      <w:proofErr w:type="spellEnd"/>
+      <w:r>
+        <w:rPr>
+          <w:rFonts w:ascii="Arial" w:hAnsi="Arial" w:cs="Arial"/>
+          <w:sz w:val="24"/>
+          <w:szCs w:val="24"/>
+          <w:lang w:eastAsia="es-EC"/>
+        </w:rPr>
+        <w:t>/</w:t>
+      </w:r>
+      <w:proofErr w:type="spellStart"/>
+      <w:r>
+        <w:rPr>
+          <w:rFonts w:ascii="Arial" w:hAnsi="Arial" w:cs="Arial"/>
+          <w:sz w:val="24"/>
+          <w:szCs w:val="24"/>
+          <w:lang w:eastAsia="es-EC"/>
+        </w:rPr>
+        <w:t>patron-factory</w:t>
+      </w:r>
+      <w:proofErr w:type="spellEnd"/>
+      <w:r>
+        <w:rPr>
+          <w:rFonts w:ascii="Arial" w:hAnsi="Arial" w:cs="Arial"/>
+          <w:sz w:val="24"/>
+          <w:szCs w:val="24"/>
+          <w:lang w:eastAsia="es-EC"/>
+        </w:rPr>
+        <w:t xml:space="preserve">: Estructuración de clases abstractas y fábricas concretas para expedientes.   </w:t>
+      </w:r>
+    </w:p>
+    <w:p>
+      <w:pPr>
+        <w:pStyle w:val="Prrafodelista"/>
+        <w:widowControl w:val="0"/>
+        <w:numPr>
+          <w:ilvl w:val="0"/>
+          <w:numId w:val="25"/>
+        </w:numPr>
+        <w:pBdr>
+          <w:top w:val="nil"/>
+          <w:left w:val="nil"/>
+          <w:bottom w:val="nil"/>
+          <w:right w:val="nil"/>
+          <w:between w:val="nil"/>
+        </w:pBdr>
+        <w:spacing w:after="0" w:line="360" w:lineRule="auto"/>
+        <w:jc w:val="both"/>
+        <w:rPr>
+          <w:rFonts w:ascii="Arial" w:hAnsi="Arial" w:cs="Arial"/>
+          <w:sz w:val="24"/>
+          <w:szCs w:val="24"/>
+          <w:lang w:eastAsia="es-EC"/>
+        </w:rPr>
+      </w:pPr>
+      <w:proofErr w:type="spellStart"/>
+      <w:r>
+        <w:rPr>
+          <w:rFonts w:ascii="Arial" w:hAnsi="Arial" w:cs="Arial"/>
+          <w:sz w:val="24"/>
+          <w:szCs w:val="24"/>
+          <w:lang w:eastAsia="es-EC"/>
+        </w:rPr>
+        <w:t>feature</w:t>
+      </w:r>
+      <w:proofErr w:type="spellEnd"/>
+      <w:r>
+        <w:rPr>
+          <w:rFonts w:ascii="Arial" w:hAnsi="Arial" w:cs="Arial"/>
+          <w:sz w:val="24"/>
+          <w:szCs w:val="24"/>
+          <w:lang w:eastAsia="es-EC"/>
+        </w:rPr>
+        <w:t>/patrones-</w:t>
+      </w:r>
+      <w:proofErr w:type="spellStart"/>
+      <w:r>
+        <w:rPr>
+          <w:rFonts w:ascii="Arial" w:hAnsi="Arial" w:cs="Arial"/>
+          <w:sz w:val="24"/>
+          <w:szCs w:val="24"/>
+          <w:lang w:eastAsia="es-EC"/>
+        </w:rPr>
+        <w:t>observer</w:t>
+      </w:r>
+      <w:proofErr w:type="spellEnd"/>
+      <w:r>
+        <w:rPr>
+          <w:rFonts w:ascii="Arial" w:hAnsi="Arial" w:cs="Arial"/>
+          <w:sz w:val="24"/>
+          <w:szCs w:val="24"/>
+          <w:lang w:eastAsia="es-EC"/>
+        </w:rPr>
+        <w:t>-</w:t>
+      </w:r>
+      <w:proofErr w:type="spellStart"/>
+      <w:r>
+        <w:rPr>
+          <w:rFonts w:ascii="Arial" w:hAnsi="Arial" w:cs="Arial"/>
+          <w:sz w:val="24"/>
+          <w:szCs w:val="24"/>
+          <w:lang w:eastAsia="es-EC"/>
+        </w:rPr>
+        <w:t>adapter</w:t>
+      </w:r>
+      <w:proofErr w:type="spellEnd"/>
+      <w:r>
+        <w:rPr>
+          <w:rFonts w:ascii="Arial" w:hAnsi="Arial" w:cs="Arial"/>
+          <w:sz w:val="24"/>
+          <w:szCs w:val="24"/>
+          <w:lang w:eastAsia="es-EC"/>
+        </w:rPr>
+        <w:t xml:space="preserve">: Integración de notificaciones reactivas y desacoplamiento de servicios de mensajería.   </w:t>
+      </w:r>
+    </w:p>
+    <w:p>
+      <w:pPr>
+        <w:widowControl w:val="0"/>
+        <w:pBdr>
+          <w:top w:val="nil"/>
+          <w:left w:val="nil"/>
+          <w:bottom w:val="nil"/>
+          <w:right w:val="nil"/>
+          <w:between w:val="nil"/>
+        </w:pBdr>
+        <w:spacing w:after="0" w:line="360" w:lineRule="auto"/>
+        <w:jc w:val="both"/>
+        <w:rPr>
+          <w:rFonts w:ascii="Arial" w:hAnsi="Arial" w:cs="Arial"/>
+          <w:sz w:val="24"/>
+          <w:szCs w:val="24"/>
+          <w:lang w:eastAsia="es-EC"/>
+        </w:rPr>
+      </w:pPr>
+      <w:r>
+        <w:rPr>
+          <w:rFonts w:ascii="Arial" w:hAnsi="Arial" w:cs="Arial"/>
+          <w:sz w:val="24"/>
+          <w:szCs w:val="24"/>
+          <w:lang w:eastAsia="es-EC"/>
+        </w:rPr>
+        <w:t>Enlace del repositorio oficial de GitHub:</w:t>
+      </w:r>
+    </w:p>
+    <w:p>
+      <w:pPr>
+        <w:widowControl w:val="0"/>
+        <w:pBdr>
+          <w:top w:val="nil"/>
+          <w:left w:val="nil"/>
+          <w:bottom w:val="nil"/>
+          <w:right w:val="nil"/>
+          <w:between w:val="nil"/>
+        </w:pBdr>
+        <w:spacing w:after="0" w:line="360" w:lineRule="auto"/>
+        <w:jc w:val="both"/>
+        <w:rPr>
+          <w:rFonts w:ascii="Arial" w:hAnsi="Arial" w:cs="Arial"/>
+          <w:sz w:val="24"/>
+          <w:szCs w:val="24"/>
+          <w:lang w:eastAsia="es-EC"/>
+        </w:rPr>
+      </w:pPr>
+      <w:hyperlink r:id="rId17" w:history="1">
+        <w:r>
+          <w:rPr>
+            <w:rStyle w:val="Hipervnculo"/>
+            <w:rFonts w:ascii="Arial" w:hAnsi="Arial" w:cs="Arial"/>
+            <w:sz w:val="24"/>
+            <w:szCs w:val="24"/>
+            <w:lang w:eastAsia="es-EC"/>
+          </w:rPr>
+          <w:t>https://github.com/dalonzo6245/rescate-adopcion-animal.git</w:t>
+        </w:r>
+      </w:hyperlink>
+    </w:p>
+    <w:p>
+      <w:pPr>
+        <w:widowControl w:val="0"/>
+        <w:pBdr>
+          <w:top w:val="nil"/>
+          <w:left w:val="nil"/>
+          <w:bottom w:val="nil"/>
+          <w:right w:val="nil"/>
+          <w:between w:val="nil"/>
+        </w:pBdr>
+        <w:spacing w:after="0" w:line="360" w:lineRule="auto"/>
+        <w:jc w:val="both"/>
+        <w:rPr>
+          <w:rFonts w:ascii="Arial" w:hAnsi="Arial" w:cs="Arial"/>
+          <w:sz w:val="24"/>
+          <w:szCs w:val="24"/>
+          <w:lang w:eastAsia="es-EC"/>
+        </w:rPr>
+      </w:pPr>
     </w:p>
     <w:p>
       <w:pPr>
@@ -3377,10 +3882,9 @@
         <w:spacing w:after="0" w:line="240" w:lineRule="auto"/>
         <w:jc w:val="both"/>
         <w:rPr>
-          <w:rFonts w:ascii="Arial" w:eastAsiaTheme="majorEastAsia" w:hAnsi="Arial" w:cs="Arial"/>
+          <w:rFonts w:ascii="Arial" w:hAnsi="Arial" w:cs="Arial"/>
           <w:b/>
           <w:bCs/>
-          <w:color w:val="2F5496" w:themeColor="accent1" w:themeShade="BF"/>
           <w:sz w:val="24"/>
           <w:szCs w:val="24"/>
           <w:lang w:eastAsia="es-EC"/>
@@ -3391,58 +3895,45 @@
           <w:rFonts w:ascii="Arial" w:hAnsi="Arial" w:cs="Arial"/>
           <w:b/>
           <w:bCs/>
-          <w:i/>
-          <w:iCs/>
-          <w:sz w:val="20"/>
-          <w:szCs w:val="20"/>
-          <w:lang w:eastAsia="es-EC"/>
-        </w:rPr>
-        <w:t>(</w:t>
-      </w:r>
-      <w:r>
-        <w:rPr>
-          <w:rFonts w:ascii="Arial" w:eastAsia="Arial" w:hAnsi="Arial" w:cs="Arial"/>
-          <w:i/>
-          <w:iCs/>
-          <w:color w:val="000000"/>
-          <w:sz w:val="20"/>
-          <w:szCs w:val="20"/>
-        </w:rPr>
-        <w:t>Código de la ejecución de los ejercicios, enlace drive donde se encuentren los mismos y Capturas de pantalla claras y relevantes, donde evidencie el proceso realizado).</w:t>
-      </w:r>
-      <w:r>
-        <w:rPr>
-          <w:rFonts w:ascii="Arial" w:hAnsi="Arial" w:cs="Arial"/>
-          <w:b/>
-          <w:bCs/>
-          <w:sz w:val="24"/>
-          <w:szCs w:val="24"/>
-          <w:lang w:eastAsia="es-EC"/>
-        </w:rPr>
-        <w:br w:type="page"/>
-      </w:r>
-    </w:p>
-    <w:p>
-      <w:pPr>
-        <w:pStyle w:val="Sinespaciado"/>
-        <w:spacing w:line="360" w:lineRule="auto"/>
-        <w:jc w:val="both"/>
-        <w:rPr>
-          <w:rFonts w:ascii="Arial" w:hAnsi="Arial" w:cs="Arial"/>
-          <w:b/>
-          <w:bCs/>
-          <w:lang w:eastAsia="es-EC"/>
-        </w:rPr>
-      </w:pPr>
-      <w:r>
-        <w:rPr>
-          <w:rFonts w:ascii="Arial" w:hAnsi="Arial" w:cs="Arial"/>
-          <w:b/>
-          <w:bCs/>
-          <w:lang w:eastAsia="es-EC"/>
-        </w:rPr>
-        <w:lastRenderedPageBreak/>
-        <w:t>Bibliografía</w:t>
+          <w:sz w:val="24"/>
+          <w:szCs w:val="24"/>
+          <w:lang w:eastAsia="es-EC"/>
+        </w:rPr>
+        <w:drawing>
+          <wp:inline distT="0" distB="0" distL="0" distR="0" wp14:anchorId="5664C009" wp14:editId="1BDE854A">
+            <wp:extent cx="5400040" cy="2894330"/>
+            <wp:effectExtent l="0" t="0" r="0" b="1270"/>
+            <wp:docPr id="5" name="Imagen 5"/>
+            <wp:cNvGraphicFramePr>
+              <a:graphicFrameLocks xmlns:a="http://schemas.openxmlformats.org/drawingml/2006/main" noChangeAspect="1"/>
+            </wp:cNvGraphicFramePr>
+            <a:graphic xmlns:a="http://schemas.openxmlformats.org/drawingml/2006/main">
+              <a:graphicData uri="http://schemas.openxmlformats.org/drawingml/2006/picture">
+                <pic:pic xmlns:pic="http://schemas.openxmlformats.org/drawingml/2006/picture">
+                  <pic:nvPicPr>
+                    <pic:cNvPr id="1" name=""/>
+                    <pic:cNvPicPr/>
+                  </pic:nvPicPr>
+                  <pic:blipFill>
+                    <a:blip r:embed="rId18"/>
+                    <a:stretch>
+                      <a:fillRect/>
+                    </a:stretch>
+                  </pic:blipFill>
+                  <pic:spPr>
+                    <a:xfrm>
+                      <a:off x="0" y="0"/>
+                      <a:ext cx="5400040" cy="2894330"/>
+                    </a:xfrm>
+                    <a:prstGeom prst="rect">
+                      <a:avLst/>
+                    </a:prstGeom>
+                  </pic:spPr>
+                </pic:pic>
+              </a:graphicData>
+            </a:graphic>
+          </wp:inline>
+        </w:drawing>
       </w:r>
     </w:p>
     <w:p>
@@ -3459,49 +3950,981 @@
         <w:jc w:val="both"/>
         <w:rPr>
           <w:rFonts w:ascii="Arial" w:hAnsi="Arial" w:cs="Arial"/>
-          <w:i/>
-          <w:iCs/>
-          <w:sz w:val="20"/>
-          <w:szCs w:val="20"/>
-          <w:lang w:eastAsia="es-EC"/>
-        </w:rPr>
-      </w:pPr>
-      <w:r>
-        <w:rPr>
-          <w:rFonts w:ascii="Arial" w:hAnsi="Arial" w:cs="Arial"/>
-          <w:i/>
-          <w:iCs/>
-          <w:sz w:val="20"/>
-          <w:szCs w:val="20"/>
-          <w:lang w:eastAsia="es-EC"/>
-        </w:rPr>
-        <w:t>(</w:t>
-      </w:r>
-      <w:r>
-        <w:rPr>
-          <w:rFonts w:ascii="Arial" w:hAnsi="Arial" w:cs="Arial"/>
-          <w:i/>
-          <w:iCs/>
-          <w:sz w:val="20"/>
-          <w:szCs w:val="20"/>
-          <w:lang w:eastAsia="es-EC"/>
-        </w:rPr>
-        <w:t>Referencias bibliográficas y/o enlaces en Internet (normas APA) que se utilizaron para realizar la práctica.</w:t>
-      </w:r>
-      <w:r>
-        <w:rPr>
-          <w:rFonts w:ascii="Arial" w:hAnsi="Arial" w:cs="Arial"/>
-          <w:i/>
-          <w:iCs/>
-          <w:sz w:val="20"/>
-          <w:szCs w:val="20"/>
-          <w:lang w:eastAsia="es-EC"/>
-        </w:rPr>
-        <w:t>)</w:t>
+          <w:b/>
+          <w:bCs/>
+          <w:sz w:val="24"/>
+          <w:szCs w:val="24"/>
+          <w:lang w:eastAsia="es-EC"/>
+        </w:rPr>
+      </w:pPr>
+    </w:p>
+    <w:p>
+      <w:pPr>
+        <w:widowControl w:val="0"/>
+        <w:pBdr>
+          <w:top w:val="nil"/>
+          <w:left w:val="nil"/>
+          <w:bottom w:val="nil"/>
+          <w:right w:val="nil"/>
+          <w:between w:val="nil"/>
+        </w:pBdr>
+        <w:spacing w:after="0" w:line="240" w:lineRule="auto"/>
+        <w:jc w:val="both"/>
+        <w:rPr>
+          <w:rFonts w:ascii="Arial" w:hAnsi="Arial" w:cs="Arial"/>
+          <w:b/>
+          <w:bCs/>
+          <w:sz w:val="24"/>
+          <w:szCs w:val="24"/>
+          <w:lang w:eastAsia="es-EC"/>
+        </w:rPr>
+      </w:pPr>
+      <w:r>
+        <w:rPr>
+          <w:rFonts w:ascii="Arial" w:hAnsi="Arial" w:cs="Arial"/>
+          <w:b/>
+          <w:bCs/>
+          <w:sz w:val="24"/>
+          <w:szCs w:val="24"/>
+          <w:lang w:eastAsia="es-EC"/>
+        </w:rPr>
+        <w:drawing>
+          <wp:inline distT="0" distB="0" distL="0" distR="0" wp14:anchorId="4CCB28F2" wp14:editId="798CEC99">
+            <wp:extent cx="5400040" cy="2884170"/>
+            <wp:effectExtent l="0" t="0" r="0" b="0"/>
+            <wp:docPr id="7" name="Imagen 7"/>
+            <wp:cNvGraphicFramePr>
+              <a:graphicFrameLocks xmlns:a="http://schemas.openxmlformats.org/drawingml/2006/main" noChangeAspect="1"/>
+            </wp:cNvGraphicFramePr>
+            <a:graphic xmlns:a="http://schemas.openxmlformats.org/drawingml/2006/main">
+              <a:graphicData uri="http://schemas.openxmlformats.org/drawingml/2006/picture">
+                <pic:pic xmlns:pic="http://schemas.openxmlformats.org/drawingml/2006/picture">
+                  <pic:nvPicPr>
+                    <pic:cNvPr id="1" name=""/>
+                    <pic:cNvPicPr/>
+                  </pic:nvPicPr>
+                  <pic:blipFill>
+                    <a:blip r:embed="rId19"/>
+                    <a:stretch>
+                      <a:fillRect/>
+                    </a:stretch>
+                  </pic:blipFill>
+                  <pic:spPr>
+                    <a:xfrm>
+                      <a:off x="0" y="0"/>
+                      <a:ext cx="5400040" cy="2884170"/>
+                    </a:xfrm>
+                    <a:prstGeom prst="rect">
+                      <a:avLst/>
+                    </a:prstGeom>
+                  </pic:spPr>
+                </pic:pic>
+              </a:graphicData>
+            </a:graphic>
+          </wp:inline>
+        </w:drawing>
+      </w:r>
+    </w:p>
+    <w:p>
+      <w:pPr>
+        <w:widowControl w:val="0"/>
+        <w:pBdr>
+          <w:top w:val="nil"/>
+          <w:left w:val="nil"/>
+          <w:bottom w:val="nil"/>
+          <w:right w:val="nil"/>
+          <w:between w:val="nil"/>
+        </w:pBdr>
+        <w:spacing w:after="0" w:line="240" w:lineRule="auto"/>
+        <w:jc w:val="both"/>
+        <w:rPr>
+          <w:rFonts w:ascii="Arial" w:hAnsi="Arial" w:cs="Arial"/>
+          <w:b/>
+          <w:bCs/>
+          <w:sz w:val="24"/>
+          <w:szCs w:val="24"/>
+          <w:lang w:eastAsia="es-EC"/>
+        </w:rPr>
+      </w:pPr>
+      <w:r>
+        <w:rPr>
+          <w:rFonts w:ascii="Arial" w:hAnsi="Arial" w:cs="Arial"/>
+          <w:b/>
+          <w:bCs/>
+          <w:sz w:val="24"/>
+          <w:szCs w:val="24"/>
+          <w:lang w:eastAsia="es-EC"/>
+        </w:rPr>
+        <w:lastRenderedPageBreak/>
+        <w:drawing>
+          <wp:inline distT="0" distB="0" distL="0" distR="0" wp14:anchorId="640AA2BF" wp14:editId="3F4D2CA3">
+            <wp:extent cx="5400040" cy="2950845"/>
+            <wp:effectExtent l="0" t="0" r="0" b="1905"/>
+            <wp:docPr id="8" name="Imagen 8"/>
+            <wp:cNvGraphicFramePr>
+              <a:graphicFrameLocks xmlns:a="http://schemas.openxmlformats.org/drawingml/2006/main" noChangeAspect="1"/>
+            </wp:cNvGraphicFramePr>
+            <a:graphic xmlns:a="http://schemas.openxmlformats.org/drawingml/2006/main">
+              <a:graphicData uri="http://schemas.openxmlformats.org/drawingml/2006/picture">
+                <pic:pic xmlns:pic="http://schemas.openxmlformats.org/drawingml/2006/picture">
+                  <pic:nvPicPr>
+                    <pic:cNvPr id="1" name=""/>
+                    <pic:cNvPicPr/>
+                  </pic:nvPicPr>
+                  <pic:blipFill>
+                    <a:blip r:embed="rId20"/>
+                    <a:stretch>
+                      <a:fillRect/>
+                    </a:stretch>
+                  </pic:blipFill>
+                  <pic:spPr>
+                    <a:xfrm>
+                      <a:off x="0" y="0"/>
+                      <a:ext cx="5400040" cy="2950845"/>
+                    </a:xfrm>
+                    <a:prstGeom prst="rect">
+                      <a:avLst/>
+                    </a:prstGeom>
+                  </pic:spPr>
+                </pic:pic>
+              </a:graphicData>
+            </a:graphic>
+          </wp:inline>
+        </w:drawing>
+      </w:r>
+    </w:p>
+    <w:p>
+      <w:pPr>
+        <w:widowControl w:val="0"/>
+        <w:pBdr>
+          <w:top w:val="nil"/>
+          <w:left w:val="nil"/>
+          <w:bottom w:val="nil"/>
+          <w:right w:val="nil"/>
+          <w:between w:val="nil"/>
+        </w:pBdr>
+        <w:spacing w:after="0" w:line="240" w:lineRule="auto"/>
+        <w:jc w:val="both"/>
+        <w:rPr>
+          <w:rFonts w:ascii="Arial" w:hAnsi="Arial" w:cs="Arial"/>
+          <w:b/>
+          <w:bCs/>
+          <w:sz w:val="24"/>
+          <w:szCs w:val="24"/>
+          <w:lang w:eastAsia="es-EC"/>
+        </w:rPr>
+      </w:pPr>
+      <w:r>
+        <w:rPr>
+          <w:rFonts w:ascii="Arial" w:hAnsi="Arial" w:cs="Arial"/>
+          <w:b/>
+          <w:bCs/>
+          <w:sz w:val="24"/>
+          <w:szCs w:val="24"/>
+          <w:lang w:eastAsia="es-EC"/>
+        </w:rPr>
+        <w:drawing>
+          <wp:inline distT="0" distB="0" distL="0" distR="0" wp14:anchorId="201979D6" wp14:editId="2F42EF1F">
+            <wp:extent cx="5400040" cy="3048635"/>
+            <wp:effectExtent l="0" t="0" r="0" b="0"/>
+            <wp:docPr id="9" name="Imagen 9"/>
+            <wp:cNvGraphicFramePr>
+              <a:graphicFrameLocks xmlns:a="http://schemas.openxmlformats.org/drawingml/2006/main" noChangeAspect="1"/>
+            </wp:cNvGraphicFramePr>
+            <a:graphic xmlns:a="http://schemas.openxmlformats.org/drawingml/2006/main">
+              <a:graphicData uri="http://schemas.openxmlformats.org/drawingml/2006/picture">
+                <pic:pic xmlns:pic="http://schemas.openxmlformats.org/drawingml/2006/picture">
+                  <pic:nvPicPr>
+                    <pic:cNvPr id="1" name=""/>
+                    <pic:cNvPicPr/>
+                  </pic:nvPicPr>
+                  <pic:blipFill>
+                    <a:blip r:embed="rId21"/>
+                    <a:stretch>
+                      <a:fillRect/>
+                    </a:stretch>
+                  </pic:blipFill>
+                  <pic:spPr>
+                    <a:xfrm>
+                      <a:off x="0" y="0"/>
+                      <a:ext cx="5400040" cy="3048635"/>
+                    </a:xfrm>
+                    <a:prstGeom prst="rect">
+                      <a:avLst/>
+                    </a:prstGeom>
+                  </pic:spPr>
+                </pic:pic>
+              </a:graphicData>
+            </a:graphic>
+          </wp:inline>
+        </w:drawing>
+      </w:r>
+    </w:p>
+    <w:p>
+      <w:pPr>
+        <w:widowControl w:val="0"/>
+        <w:pBdr>
+          <w:top w:val="nil"/>
+          <w:left w:val="nil"/>
+          <w:bottom w:val="nil"/>
+          <w:right w:val="nil"/>
+          <w:between w:val="nil"/>
+        </w:pBdr>
+        <w:spacing w:after="0" w:line="240" w:lineRule="auto"/>
+        <w:jc w:val="both"/>
+        <w:rPr>
+          <w:rFonts w:ascii="Arial" w:eastAsiaTheme="majorEastAsia" w:hAnsi="Arial" w:cs="Arial"/>
+          <w:b/>
+          <w:bCs/>
+          <w:color w:val="2F5496" w:themeColor="accent1" w:themeShade="BF"/>
+          <w:sz w:val="24"/>
+          <w:szCs w:val="24"/>
+          <w:lang w:eastAsia="es-EC"/>
+        </w:rPr>
+      </w:pPr>
+      <w:r>
+        <w:rPr>
+          <w:rFonts w:ascii="Arial" w:hAnsi="Arial" w:cs="Arial"/>
+          <w:b/>
+          <w:bCs/>
+          <w:sz w:val="24"/>
+          <w:szCs w:val="24"/>
+          <w:lang w:eastAsia="es-EC"/>
+        </w:rPr>
+        <w:lastRenderedPageBreak/>
+        <w:drawing>
+          <wp:inline distT="0" distB="0" distL="0" distR="0" wp14:anchorId="16B7003B" wp14:editId="73E60C07">
+            <wp:extent cx="5400040" cy="3003550"/>
+            <wp:effectExtent l="0" t="0" r="0" b="6350"/>
+            <wp:docPr id="10" name="Imagen 10"/>
+            <wp:cNvGraphicFramePr>
+              <a:graphicFrameLocks xmlns:a="http://schemas.openxmlformats.org/drawingml/2006/main" noChangeAspect="1"/>
+            </wp:cNvGraphicFramePr>
+            <a:graphic xmlns:a="http://schemas.openxmlformats.org/drawingml/2006/main">
+              <a:graphicData uri="http://schemas.openxmlformats.org/drawingml/2006/picture">
+                <pic:pic xmlns:pic="http://schemas.openxmlformats.org/drawingml/2006/picture">
+                  <pic:nvPicPr>
+                    <pic:cNvPr id="1" name=""/>
+                    <pic:cNvPicPr/>
+                  </pic:nvPicPr>
+                  <pic:blipFill>
+                    <a:blip r:embed="rId22"/>
+                    <a:stretch>
+                      <a:fillRect/>
+                    </a:stretch>
+                  </pic:blipFill>
+                  <pic:spPr>
+                    <a:xfrm>
+                      <a:off x="0" y="0"/>
+                      <a:ext cx="5400040" cy="3003550"/>
+                    </a:xfrm>
+                    <a:prstGeom prst="rect">
+                      <a:avLst/>
+                    </a:prstGeom>
+                  </pic:spPr>
+                </pic:pic>
+              </a:graphicData>
+            </a:graphic>
+          </wp:inline>
+        </w:drawing>
+      </w:r>
+      <w:r>
+        <w:rPr>
+          <w:rFonts w:ascii="Arial" w:hAnsi="Arial" w:cs="Arial"/>
+          <w:b/>
+          <w:bCs/>
+          <w:sz w:val="24"/>
+          <w:szCs w:val="24"/>
+          <w:lang w:eastAsia="es-EC"/>
+        </w:rPr>
+        <w:br w:type="page"/>
+      </w:r>
+    </w:p>
+    <w:p>
+      <w:pPr>
+        <w:pStyle w:val="Sinespaciado"/>
+        <w:spacing w:line="360" w:lineRule="auto"/>
+        <w:jc w:val="both"/>
+        <w:rPr>
+          <w:rFonts w:ascii="Arial" w:hAnsi="Arial" w:cs="Arial"/>
+          <w:b/>
+          <w:bCs/>
+          <w:sz w:val="24"/>
+          <w:szCs w:val="24"/>
+          <w:lang w:eastAsia="es-EC"/>
+        </w:rPr>
+      </w:pPr>
+      <w:r>
+        <w:rPr>
+          <w:rFonts w:ascii="Arial" w:hAnsi="Arial" w:cs="Arial"/>
+          <w:b/>
+          <w:bCs/>
+          <w:sz w:val="24"/>
+          <w:szCs w:val="24"/>
+          <w:lang w:eastAsia="es-EC"/>
+        </w:rPr>
+        <w:lastRenderedPageBreak/>
+        <w:t>Bibliografía</w:t>
+      </w:r>
+    </w:p>
+    <w:p>
+      <w:pPr>
+        <w:widowControl w:val="0"/>
+        <w:pBdr>
+          <w:top w:val="nil"/>
+          <w:left w:val="nil"/>
+          <w:bottom w:val="nil"/>
+          <w:right w:val="nil"/>
+          <w:between w:val="nil"/>
+        </w:pBdr>
+        <w:spacing w:after="0" w:line="240" w:lineRule="auto"/>
+        <w:jc w:val="both"/>
+        <w:rPr>
+          <w:rFonts w:ascii="Arial" w:hAnsi="Arial" w:cs="Arial"/>
+          <w:sz w:val="24"/>
+          <w:szCs w:val="24"/>
+          <w:lang w:eastAsia="es-EC"/>
+        </w:rPr>
+      </w:pPr>
+      <w:r>
+        <w:rPr>
+          <w:rFonts w:ascii="Arial" w:hAnsi="Arial" w:cs="Arial"/>
+          <w:sz w:val="24"/>
+          <w:szCs w:val="24"/>
+          <w:lang w:eastAsia="es-EC"/>
+        </w:rPr>
+        <w:t xml:space="preserve">Gamma, E., Helm, R., Johnson, R., &amp; </w:t>
+      </w:r>
+      <w:proofErr w:type="spellStart"/>
+      <w:r>
+        <w:rPr>
+          <w:rFonts w:ascii="Arial" w:hAnsi="Arial" w:cs="Arial"/>
+          <w:sz w:val="24"/>
+          <w:szCs w:val="24"/>
+          <w:lang w:eastAsia="es-EC"/>
+        </w:rPr>
+        <w:t>Vlissides</w:t>
+      </w:r>
+      <w:proofErr w:type="spellEnd"/>
+      <w:r>
+        <w:rPr>
+          <w:rFonts w:ascii="Arial" w:hAnsi="Arial" w:cs="Arial"/>
+          <w:sz w:val="24"/>
+          <w:szCs w:val="24"/>
+          <w:lang w:eastAsia="es-EC"/>
+        </w:rPr>
+        <w:t xml:space="preserve">, J. (1995). </w:t>
+      </w:r>
+      <w:proofErr w:type="spellStart"/>
+      <w:r>
+        <w:rPr>
+          <w:rFonts w:ascii="Arial" w:hAnsi="Arial" w:cs="Arial"/>
+          <w:sz w:val="24"/>
+          <w:szCs w:val="24"/>
+          <w:lang w:eastAsia="es-EC"/>
+        </w:rPr>
+        <w:t>Design</w:t>
+      </w:r>
+      <w:proofErr w:type="spellEnd"/>
+      <w:r>
+        <w:rPr>
+          <w:rFonts w:ascii="Arial" w:hAnsi="Arial" w:cs="Arial"/>
+          <w:sz w:val="24"/>
+          <w:szCs w:val="24"/>
+          <w:lang w:eastAsia="es-EC"/>
+        </w:rPr>
+        <w:t xml:space="preserve"> </w:t>
+      </w:r>
+      <w:proofErr w:type="spellStart"/>
+      <w:r>
+        <w:rPr>
+          <w:rFonts w:ascii="Arial" w:hAnsi="Arial" w:cs="Arial"/>
+          <w:sz w:val="24"/>
+          <w:szCs w:val="24"/>
+          <w:lang w:eastAsia="es-EC"/>
+        </w:rPr>
+        <w:t>Patterns</w:t>
+      </w:r>
+      <w:proofErr w:type="spellEnd"/>
+      <w:r>
+        <w:rPr>
+          <w:rFonts w:ascii="Arial" w:hAnsi="Arial" w:cs="Arial"/>
+          <w:sz w:val="24"/>
+          <w:szCs w:val="24"/>
+          <w:lang w:eastAsia="es-EC"/>
+        </w:rPr>
+        <w:t xml:space="preserve">: </w:t>
+      </w:r>
+      <w:proofErr w:type="spellStart"/>
+      <w:r>
+        <w:rPr>
+          <w:rFonts w:ascii="Arial" w:hAnsi="Arial" w:cs="Arial"/>
+          <w:sz w:val="24"/>
+          <w:szCs w:val="24"/>
+          <w:lang w:eastAsia="es-EC"/>
+        </w:rPr>
+        <w:t>Elements</w:t>
+      </w:r>
+      <w:proofErr w:type="spellEnd"/>
+      <w:r>
+        <w:rPr>
+          <w:rFonts w:ascii="Arial" w:hAnsi="Arial" w:cs="Arial"/>
+          <w:sz w:val="24"/>
+          <w:szCs w:val="24"/>
+          <w:lang w:eastAsia="es-EC"/>
+        </w:rPr>
+        <w:t xml:space="preserve"> </w:t>
+      </w:r>
+      <w:proofErr w:type="spellStart"/>
+      <w:r>
+        <w:rPr>
+          <w:rFonts w:ascii="Arial" w:hAnsi="Arial" w:cs="Arial"/>
+          <w:sz w:val="24"/>
+          <w:szCs w:val="24"/>
+          <w:lang w:eastAsia="es-EC"/>
+        </w:rPr>
+        <w:t>of</w:t>
+      </w:r>
+      <w:proofErr w:type="spellEnd"/>
+      <w:r>
+        <w:rPr>
+          <w:rFonts w:ascii="Arial" w:hAnsi="Arial" w:cs="Arial"/>
+          <w:sz w:val="24"/>
+          <w:szCs w:val="24"/>
+          <w:lang w:eastAsia="es-EC"/>
+        </w:rPr>
+        <w:t xml:space="preserve"> Reusable </w:t>
+      </w:r>
+      <w:proofErr w:type="spellStart"/>
+      <w:r>
+        <w:rPr>
+          <w:rFonts w:ascii="Arial" w:hAnsi="Arial" w:cs="Arial"/>
+          <w:sz w:val="24"/>
+          <w:szCs w:val="24"/>
+          <w:lang w:eastAsia="es-EC"/>
+        </w:rPr>
+        <w:t>Object-Oriented</w:t>
+      </w:r>
+      <w:proofErr w:type="spellEnd"/>
+      <w:r>
+        <w:rPr>
+          <w:rFonts w:ascii="Arial" w:hAnsi="Arial" w:cs="Arial"/>
+          <w:sz w:val="24"/>
+          <w:szCs w:val="24"/>
+          <w:lang w:eastAsia="es-EC"/>
+        </w:rPr>
+        <w:t xml:space="preserve"> Software. Addison-Wesley.</w:t>
+      </w:r>
+    </w:p>
+    <w:p>
+      <w:pPr>
+        <w:widowControl w:val="0"/>
+        <w:pBdr>
+          <w:top w:val="nil"/>
+          <w:left w:val="nil"/>
+          <w:bottom w:val="nil"/>
+          <w:right w:val="nil"/>
+          <w:between w:val="nil"/>
+        </w:pBdr>
+        <w:spacing w:after="0" w:line="240" w:lineRule="auto"/>
+        <w:jc w:val="both"/>
+        <w:rPr>
+          <w:rFonts w:ascii="Arial" w:hAnsi="Arial" w:cs="Arial"/>
+          <w:sz w:val="24"/>
+          <w:szCs w:val="24"/>
+          <w:lang w:eastAsia="es-EC"/>
+        </w:rPr>
+      </w:pPr>
+    </w:p>
+    <w:p>
+      <w:pPr>
+        <w:widowControl w:val="0"/>
+        <w:pBdr>
+          <w:top w:val="nil"/>
+          <w:left w:val="nil"/>
+          <w:bottom w:val="nil"/>
+          <w:right w:val="nil"/>
+          <w:between w:val="nil"/>
+        </w:pBdr>
+        <w:spacing w:after="0" w:line="240" w:lineRule="auto"/>
+        <w:jc w:val="both"/>
+        <w:rPr>
+          <w:rFonts w:ascii="Arial" w:hAnsi="Arial" w:cs="Arial"/>
+          <w:sz w:val="24"/>
+          <w:szCs w:val="24"/>
+          <w:lang w:eastAsia="es-EC"/>
+        </w:rPr>
+      </w:pPr>
+      <w:proofErr w:type="spellStart"/>
+      <w:r>
+        <w:rPr>
+          <w:rFonts w:ascii="Arial" w:hAnsi="Arial" w:cs="Arial"/>
+          <w:sz w:val="24"/>
+          <w:szCs w:val="24"/>
+          <w:lang w:eastAsia="es-EC"/>
+        </w:rPr>
+        <w:t>Fowler</w:t>
+      </w:r>
+      <w:proofErr w:type="spellEnd"/>
+      <w:r>
+        <w:rPr>
+          <w:rFonts w:ascii="Arial" w:hAnsi="Arial" w:cs="Arial"/>
+          <w:sz w:val="24"/>
+          <w:szCs w:val="24"/>
+          <w:lang w:eastAsia="es-EC"/>
+        </w:rPr>
+        <w:t xml:space="preserve">, M. (2004). UML </w:t>
+      </w:r>
+      <w:proofErr w:type="spellStart"/>
+      <w:r>
+        <w:rPr>
+          <w:rFonts w:ascii="Arial" w:hAnsi="Arial" w:cs="Arial"/>
+          <w:sz w:val="24"/>
+          <w:szCs w:val="24"/>
+          <w:lang w:eastAsia="es-EC"/>
+        </w:rPr>
+        <w:t>Distilled</w:t>
+      </w:r>
+      <w:proofErr w:type="spellEnd"/>
+      <w:r>
+        <w:rPr>
+          <w:rFonts w:ascii="Arial" w:hAnsi="Arial" w:cs="Arial"/>
+          <w:sz w:val="24"/>
+          <w:szCs w:val="24"/>
+          <w:lang w:eastAsia="es-EC"/>
+        </w:rPr>
+        <w:t xml:space="preserve">: A </w:t>
+      </w:r>
+      <w:proofErr w:type="spellStart"/>
+      <w:r>
+        <w:rPr>
+          <w:rFonts w:ascii="Arial" w:hAnsi="Arial" w:cs="Arial"/>
+          <w:sz w:val="24"/>
+          <w:szCs w:val="24"/>
+          <w:lang w:eastAsia="es-EC"/>
+        </w:rPr>
+        <w:t>Brief</w:t>
+      </w:r>
+      <w:proofErr w:type="spellEnd"/>
+      <w:r>
+        <w:rPr>
+          <w:rFonts w:ascii="Arial" w:hAnsi="Arial" w:cs="Arial"/>
+          <w:sz w:val="24"/>
+          <w:szCs w:val="24"/>
+          <w:lang w:eastAsia="es-EC"/>
+        </w:rPr>
+        <w:t xml:space="preserve"> Guide </w:t>
+      </w:r>
+      <w:proofErr w:type="spellStart"/>
+      <w:r>
+        <w:rPr>
+          <w:rFonts w:ascii="Arial" w:hAnsi="Arial" w:cs="Arial"/>
+          <w:sz w:val="24"/>
+          <w:szCs w:val="24"/>
+          <w:lang w:eastAsia="es-EC"/>
+        </w:rPr>
+        <w:t>to</w:t>
+      </w:r>
+      <w:proofErr w:type="spellEnd"/>
+      <w:r>
+        <w:rPr>
+          <w:rFonts w:ascii="Arial" w:hAnsi="Arial" w:cs="Arial"/>
+          <w:sz w:val="24"/>
+          <w:szCs w:val="24"/>
+          <w:lang w:eastAsia="es-EC"/>
+        </w:rPr>
+        <w:t xml:space="preserve"> </w:t>
+      </w:r>
+      <w:proofErr w:type="spellStart"/>
+      <w:r>
+        <w:rPr>
+          <w:rFonts w:ascii="Arial" w:hAnsi="Arial" w:cs="Arial"/>
+          <w:sz w:val="24"/>
+          <w:szCs w:val="24"/>
+          <w:lang w:eastAsia="es-EC"/>
+        </w:rPr>
+        <w:t>the</w:t>
+      </w:r>
+      <w:proofErr w:type="spellEnd"/>
+      <w:r>
+        <w:rPr>
+          <w:rFonts w:ascii="Arial" w:hAnsi="Arial" w:cs="Arial"/>
+          <w:sz w:val="24"/>
+          <w:szCs w:val="24"/>
+          <w:lang w:eastAsia="es-EC"/>
+        </w:rPr>
+        <w:t xml:space="preserve"> Standard </w:t>
+      </w:r>
+      <w:proofErr w:type="spellStart"/>
+      <w:r>
+        <w:rPr>
+          <w:rFonts w:ascii="Arial" w:hAnsi="Arial" w:cs="Arial"/>
+          <w:sz w:val="24"/>
+          <w:szCs w:val="24"/>
+          <w:lang w:eastAsia="es-EC"/>
+        </w:rPr>
+        <w:t>Object</w:t>
+      </w:r>
+      <w:proofErr w:type="spellEnd"/>
+      <w:r>
+        <w:rPr>
+          <w:rFonts w:ascii="Arial" w:hAnsi="Arial" w:cs="Arial"/>
+          <w:sz w:val="24"/>
+          <w:szCs w:val="24"/>
+          <w:lang w:eastAsia="es-EC"/>
+        </w:rPr>
+        <w:t xml:space="preserve"> </w:t>
+      </w:r>
+      <w:proofErr w:type="spellStart"/>
+      <w:r>
+        <w:rPr>
+          <w:rFonts w:ascii="Arial" w:hAnsi="Arial" w:cs="Arial"/>
+          <w:sz w:val="24"/>
+          <w:szCs w:val="24"/>
+          <w:lang w:eastAsia="es-EC"/>
+        </w:rPr>
+        <w:t>Modeling</w:t>
+      </w:r>
+      <w:proofErr w:type="spellEnd"/>
+      <w:r>
+        <w:rPr>
+          <w:rFonts w:ascii="Arial" w:hAnsi="Arial" w:cs="Arial"/>
+          <w:sz w:val="24"/>
+          <w:szCs w:val="24"/>
+          <w:lang w:eastAsia="es-EC"/>
+        </w:rPr>
+        <w:t xml:space="preserve"> </w:t>
+      </w:r>
+      <w:proofErr w:type="spellStart"/>
+      <w:r>
+        <w:rPr>
+          <w:rFonts w:ascii="Arial" w:hAnsi="Arial" w:cs="Arial"/>
+          <w:sz w:val="24"/>
+          <w:szCs w:val="24"/>
+          <w:lang w:eastAsia="es-EC"/>
+        </w:rPr>
+        <w:t>Language</w:t>
+      </w:r>
+      <w:proofErr w:type="spellEnd"/>
+      <w:r>
+        <w:rPr>
+          <w:rFonts w:ascii="Arial" w:hAnsi="Arial" w:cs="Arial"/>
+          <w:sz w:val="24"/>
+          <w:szCs w:val="24"/>
+          <w:lang w:eastAsia="es-EC"/>
+        </w:rPr>
+        <w:t xml:space="preserve"> (3.ª ed.). Addison-Wesley.</w:t>
+      </w:r>
+    </w:p>
+    <w:p>
+      <w:pPr>
+        <w:widowControl w:val="0"/>
+        <w:pBdr>
+          <w:top w:val="nil"/>
+          <w:left w:val="nil"/>
+          <w:bottom w:val="nil"/>
+          <w:right w:val="nil"/>
+          <w:between w:val="nil"/>
+        </w:pBdr>
+        <w:spacing w:after="0" w:line="240" w:lineRule="auto"/>
+        <w:jc w:val="both"/>
+        <w:rPr>
+          <w:rFonts w:ascii="Arial" w:hAnsi="Arial" w:cs="Arial"/>
+          <w:sz w:val="24"/>
+          <w:szCs w:val="24"/>
+          <w:lang w:eastAsia="es-EC"/>
+        </w:rPr>
+      </w:pPr>
+    </w:p>
+    <w:p>
+      <w:pPr>
+        <w:widowControl w:val="0"/>
+        <w:pBdr>
+          <w:top w:val="nil"/>
+          <w:left w:val="nil"/>
+          <w:bottom w:val="nil"/>
+          <w:right w:val="nil"/>
+          <w:between w:val="nil"/>
+        </w:pBdr>
+        <w:spacing w:after="0" w:line="240" w:lineRule="auto"/>
+        <w:jc w:val="both"/>
+        <w:rPr>
+          <w:rFonts w:ascii="Arial" w:hAnsi="Arial" w:cs="Arial"/>
+          <w:sz w:val="24"/>
+          <w:szCs w:val="24"/>
+          <w:lang w:eastAsia="es-EC"/>
+        </w:rPr>
+      </w:pPr>
+      <w:r>
+        <w:rPr>
+          <w:rFonts w:ascii="Arial" w:hAnsi="Arial" w:cs="Arial"/>
+          <w:sz w:val="24"/>
+          <w:szCs w:val="24"/>
+          <w:lang w:eastAsia="es-EC"/>
+        </w:rPr>
+        <w:t xml:space="preserve">Martin, R. C. (2018). </w:t>
+      </w:r>
+      <w:proofErr w:type="spellStart"/>
+      <w:r>
+        <w:rPr>
+          <w:rFonts w:ascii="Arial" w:hAnsi="Arial" w:cs="Arial"/>
+          <w:sz w:val="24"/>
+          <w:szCs w:val="24"/>
+          <w:lang w:eastAsia="es-EC"/>
+        </w:rPr>
+        <w:t>Clean</w:t>
+      </w:r>
+      <w:proofErr w:type="spellEnd"/>
+      <w:r>
+        <w:rPr>
+          <w:rFonts w:ascii="Arial" w:hAnsi="Arial" w:cs="Arial"/>
+          <w:sz w:val="24"/>
+          <w:szCs w:val="24"/>
+          <w:lang w:eastAsia="es-EC"/>
+        </w:rPr>
+        <w:t xml:space="preserve"> </w:t>
+      </w:r>
+      <w:proofErr w:type="spellStart"/>
+      <w:r>
+        <w:rPr>
+          <w:rFonts w:ascii="Arial" w:hAnsi="Arial" w:cs="Arial"/>
+          <w:sz w:val="24"/>
+          <w:szCs w:val="24"/>
+          <w:lang w:eastAsia="es-EC"/>
+        </w:rPr>
+        <w:t>Architecture</w:t>
+      </w:r>
+      <w:proofErr w:type="spellEnd"/>
+      <w:r>
+        <w:rPr>
+          <w:rFonts w:ascii="Arial" w:hAnsi="Arial" w:cs="Arial"/>
+          <w:sz w:val="24"/>
+          <w:szCs w:val="24"/>
+          <w:lang w:eastAsia="es-EC"/>
+        </w:rPr>
+        <w:t xml:space="preserve">: A </w:t>
+      </w:r>
+      <w:proofErr w:type="spellStart"/>
+      <w:r>
+        <w:rPr>
+          <w:rFonts w:ascii="Arial" w:hAnsi="Arial" w:cs="Arial"/>
+          <w:sz w:val="24"/>
+          <w:szCs w:val="24"/>
+          <w:lang w:eastAsia="es-EC"/>
+        </w:rPr>
+        <w:t>Craftsman's</w:t>
+      </w:r>
+      <w:proofErr w:type="spellEnd"/>
+      <w:r>
+        <w:rPr>
+          <w:rFonts w:ascii="Arial" w:hAnsi="Arial" w:cs="Arial"/>
+          <w:sz w:val="24"/>
+          <w:szCs w:val="24"/>
+          <w:lang w:eastAsia="es-EC"/>
+        </w:rPr>
+        <w:t xml:space="preserve"> Guide </w:t>
+      </w:r>
+      <w:proofErr w:type="spellStart"/>
+      <w:r>
+        <w:rPr>
+          <w:rFonts w:ascii="Arial" w:hAnsi="Arial" w:cs="Arial"/>
+          <w:sz w:val="24"/>
+          <w:szCs w:val="24"/>
+          <w:lang w:eastAsia="es-EC"/>
+        </w:rPr>
+        <w:t>to</w:t>
+      </w:r>
+      <w:proofErr w:type="spellEnd"/>
+      <w:r>
+        <w:rPr>
+          <w:rFonts w:ascii="Arial" w:hAnsi="Arial" w:cs="Arial"/>
+          <w:sz w:val="24"/>
+          <w:szCs w:val="24"/>
+          <w:lang w:eastAsia="es-EC"/>
+        </w:rPr>
+        <w:t xml:space="preserve"> Software </w:t>
+      </w:r>
+      <w:proofErr w:type="spellStart"/>
+      <w:r>
+        <w:rPr>
+          <w:rFonts w:ascii="Arial" w:hAnsi="Arial" w:cs="Arial"/>
+          <w:sz w:val="24"/>
+          <w:szCs w:val="24"/>
+          <w:lang w:eastAsia="es-EC"/>
+        </w:rPr>
+        <w:t>Structure</w:t>
+      </w:r>
+      <w:proofErr w:type="spellEnd"/>
+      <w:r>
+        <w:rPr>
+          <w:rFonts w:ascii="Arial" w:hAnsi="Arial" w:cs="Arial"/>
+          <w:sz w:val="24"/>
+          <w:szCs w:val="24"/>
+          <w:lang w:eastAsia="es-EC"/>
+        </w:rPr>
+        <w:t xml:space="preserve"> and </w:t>
+      </w:r>
+      <w:proofErr w:type="spellStart"/>
+      <w:r>
+        <w:rPr>
+          <w:rFonts w:ascii="Arial" w:hAnsi="Arial" w:cs="Arial"/>
+          <w:sz w:val="24"/>
+          <w:szCs w:val="24"/>
+          <w:lang w:eastAsia="es-EC"/>
+        </w:rPr>
+        <w:t>Design</w:t>
+      </w:r>
+      <w:proofErr w:type="spellEnd"/>
+      <w:r>
+        <w:rPr>
+          <w:rFonts w:ascii="Arial" w:hAnsi="Arial" w:cs="Arial"/>
+          <w:sz w:val="24"/>
+          <w:szCs w:val="24"/>
+          <w:lang w:eastAsia="es-EC"/>
+        </w:rPr>
+        <w:t>. Prentice Hall.</w:t>
+      </w:r>
+    </w:p>
+    <w:p>
+      <w:pPr>
+        <w:widowControl w:val="0"/>
+        <w:pBdr>
+          <w:top w:val="nil"/>
+          <w:left w:val="nil"/>
+          <w:bottom w:val="nil"/>
+          <w:right w:val="nil"/>
+          <w:between w:val="nil"/>
+        </w:pBdr>
+        <w:spacing w:after="0" w:line="240" w:lineRule="auto"/>
+        <w:jc w:val="both"/>
+        <w:rPr>
+          <w:rFonts w:ascii="Arial" w:hAnsi="Arial" w:cs="Arial"/>
+          <w:sz w:val="24"/>
+          <w:szCs w:val="24"/>
+          <w:lang w:eastAsia="es-EC"/>
+        </w:rPr>
+      </w:pPr>
+    </w:p>
+    <w:p>
+      <w:pPr>
+        <w:widowControl w:val="0"/>
+        <w:pBdr>
+          <w:top w:val="nil"/>
+          <w:left w:val="nil"/>
+          <w:bottom w:val="nil"/>
+          <w:right w:val="nil"/>
+          <w:between w:val="nil"/>
+        </w:pBdr>
+        <w:spacing w:after="0" w:line="240" w:lineRule="auto"/>
+        <w:jc w:val="both"/>
+        <w:rPr>
+          <w:rFonts w:ascii="Arial" w:hAnsi="Arial" w:cs="Arial"/>
+          <w:sz w:val="24"/>
+          <w:szCs w:val="24"/>
+          <w:lang w:eastAsia="es-EC"/>
+        </w:rPr>
+      </w:pPr>
+      <w:r>
+        <w:rPr>
+          <w:rFonts w:ascii="Arial" w:hAnsi="Arial" w:cs="Arial"/>
+          <w:sz w:val="24"/>
+          <w:szCs w:val="24"/>
+          <w:lang w:eastAsia="es-EC"/>
+        </w:rPr>
+        <w:t xml:space="preserve">Pressman, R. S., &amp; </w:t>
+      </w:r>
+      <w:proofErr w:type="spellStart"/>
+      <w:r>
+        <w:rPr>
+          <w:rFonts w:ascii="Arial" w:hAnsi="Arial" w:cs="Arial"/>
+          <w:sz w:val="24"/>
+          <w:szCs w:val="24"/>
+          <w:lang w:eastAsia="es-EC"/>
+        </w:rPr>
+        <w:t>Maxim</w:t>
+      </w:r>
+      <w:proofErr w:type="spellEnd"/>
+      <w:r>
+        <w:rPr>
+          <w:rFonts w:ascii="Arial" w:hAnsi="Arial" w:cs="Arial"/>
+          <w:sz w:val="24"/>
+          <w:szCs w:val="24"/>
+          <w:lang w:eastAsia="es-EC"/>
+        </w:rPr>
+        <w:t xml:space="preserve">, B. R. (2021). Ingeniería del software: Un enfoque práctico (9.ª ed.). McGraw-Hill </w:t>
+      </w:r>
+      <w:proofErr w:type="spellStart"/>
+      <w:r>
+        <w:rPr>
+          <w:rFonts w:ascii="Arial" w:hAnsi="Arial" w:cs="Arial"/>
+          <w:sz w:val="24"/>
+          <w:szCs w:val="24"/>
+          <w:lang w:eastAsia="es-EC"/>
+        </w:rPr>
+        <w:t>Education</w:t>
+      </w:r>
+      <w:proofErr w:type="spellEnd"/>
+      <w:r>
+        <w:rPr>
+          <w:rFonts w:ascii="Arial" w:hAnsi="Arial" w:cs="Arial"/>
+          <w:sz w:val="24"/>
+          <w:szCs w:val="24"/>
+          <w:lang w:eastAsia="es-EC"/>
+        </w:rPr>
+        <w:t>.</w:t>
+      </w:r>
+    </w:p>
+    <w:p>
+      <w:pPr>
+        <w:widowControl w:val="0"/>
+        <w:pBdr>
+          <w:top w:val="nil"/>
+          <w:left w:val="nil"/>
+          <w:bottom w:val="nil"/>
+          <w:right w:val="nil"/>
+          <w:between w:val="nil"/>
+        </w:pBdr>
+        <w:spacing w:after="0" w:line="240" w:lineRule="auto"/>
+        <w:jc w:val="both"/>
+        <w:rPr>
+          <w:rFonts w:ascii="Arial" w:hAnsi="Arial" w:cs="Arial"/>
+          <w:sz w:val="24"/>
+          <w:szCs w:val="24"/>
+          <w:lang w:eastAsia="es-EC"/>
+        </w:rPr>
+      </w:pPr>
+    </w:p>
+    <w:p>
+      <w:pPr>
+        <w:widowControl w:val="0"/>
+        <w:pBdr>
+          <w:top w:val="nil"/>
+          <w:left w:val="nil"/>
+          <w:bottom w:val="nil"/>
+          <w:right w:val="nil"/>
+          <w:between w:val="nil"/>
+        </w:pBdr>
+        <w:spacing w:after="0" w:line="240" w:lineRule="auto"/>
+        <w:jc w:val="both"/>
+        <w:rPr>
+          <w:rFonts w:ascii="Arial" w:hAnsi="Arial" w:cs="Arial"/>
+          <w:sz w:val="24"/>
+          <w:szCs w:val="24"/>
+          <w:lang w:eastAsia="es-EC"/>
+        </w:rPr>
+      </w:pPr>
+      <w:r>
+        <w:rPr>
+          <w:rFonts w:ascii="Arial" w:hAnsi="Arial" w:cs="Arial"/>
+          <w:sz w:val="24"/>
+          <w:szCs w:val="24"/>
+          <w:lang w:eastAsia="es-EC"/>
+        </w:rPr>
+        <w:t>Sommerville, I. (2019). Ingeniería del software (10.ª ed.). Pearson Educación.</w:t>
       </w:r>
     </w:p>
     <w:sectPr>
-      <w:headerReference w:type="first" r:id="rId17"/>
+      <w:headerReference w:type="first" r:id="rId23"/>
       <w:pgSz w:w="11906" w:h="16838"/>
       <w:pgMar w:top="1417" w:right="1701" w:bottom="1417" w:left="1701" w:header="708" w:footer="708" w:gutter="0"/>
       <w:pgNumType w:start="1"/>
@@ -4377,7 +5800,7 @@
         <v:path o:extrusionok="f" gradientshapeok="t" o:connecttype="rect"/>
         <o:lock v:ext="edit" aspectratio="t"/>
       </v:shapetype>
-      <v:shape id="_x0000_i1171" type="#_x0000_t75" style="width:11.25pt;height:11.25pt" o:bullet="t">
+      <v:shape id="_x0000_i1123" type="#_x0000_t75" style="width:11.25pt;height:11.25pt" o:bullet="t">
         <v:imagedata r:id="rId1" o:title="mso3E28"/>
       </v:shape>
     </w:pict>
@@ -4724,6 +6147,119 @@
     </w:lvl>
   </w:abstractNum>
   <w:abstractNum w:abstractNumId="3" w15:restartNumberingAfterBreak="0">
+    <w:nsid w:val="201D431A"/>
+    <w:multiLevelType w:val="hybridMultilevel"/>
+    <w:tmpl w:val="F774A7AE"/>
+    <w:lvl w:ilvl="0" w:tplc="080A000B">
+      <w:start w:val="1"/>
+      <w:numFmt w:val="bullet"/>
+      <w:lvlText w:val=""/>
+      <w:lvlJc w:val="left"/>
+      <w:pPr>
+        <w:ind w:left="1068" w:hanging="360"/>
+      </w:pPr>
+      <w:rPr>
+        <w:rFonts w:ascii="Wingdings" w:hAnsi="Wingdings" w:hint="default"/>
+      </w:rPr>
+    </w:lvl>
+    <w:lvl w:ilvl="1" w:tplc="080A0003" w:tentative="1">
+      <w:start w:val="1"/>
+      <w:numFmt w:val="bullet"/>
+      <w:lvlText w:val="o"/>
+      <w:lvlJc w:val="left"/>
+      <w:pPr>
+        <w:ind w:left="1788" w:hanging="360"/>
+      </w:pPr>
+      <w:rPr>
+        <w:rFonts w:ascii="Courier New" w:hAnsi="Courier New" w:cs="Courier New" w:hint="default"/>
+      </w:rPr>
+    </w:lvl>
+    <w:lvl w:ilvl="2" w:tplc="080A0005" w:tentative="1">
+      <w:start w:val="1"/>
+      <w:numFmt w:val="bullet"/>
+      <w:lvlText w:val=""/>
+      <w:lvlJc w:val="left"/>
+      <w:pPr>
+        <w:ind w:left="2508" w:hanging="360"/>
+      </w:pPr>
+      <w:rPr>
+        <w:rFonts w:ascii="Wingdings" w:hAnsi="Wingdings" w:hint="default"/>
+      </w:rPr>
+    </w:lvl>
+    <w:lvl w:ilvl="3" w:tplc="080A0001" w:tentative="1">
+      <w:start w:val="1"/>
+      <w:numFmt w:val="bullet"/>
+      <w:lvlText w:val=""/>
+      <w:lvlJc w:val="left"/>
+      <w:pPr>
+        <w:ind w:left="3228" w:hanging="360"/>
+      </w:pPr>
+      <w:rPr>
+        <w:rFonts w:ascii="Symbol" w:hAnsi="Symbol" w:hint="default"/>
+      </w:rPr>
+    </w:lvl>
+    <w:lvl w:ilvl="4" w:tplc="080A0003" w:tentative="1">
+      <w:start w:val="1"/>
+      <w:numFmt w:val="bullet"/>
+      <w:lvlText w:val="o"/>
+      <w:lvlJc w:val="left"/>
+      <w:pPr>
+        <w:ind w:left="3948" w:hanging="360"/>
+      </w:pPr>
+      <w:rPr>
+        <w:rFonts w:ascii="Courier New" w:hAnsi="Courier New" w:cs="Courier New" w:hint="default"/>
+      </w:rPr>
+    </w:lvl>
+    <w:lvl w:ilvl="5" w:tplc="080A0005" w:tentative="1">
+      <w:start w:val="1"/>
+      <w:numFmt w:val="bullet"/>
+      <w:lvlText w:val=""/>
+      <w:lvlJc w:val="left"/>
+      <w:pPr>
+        <w:ind w:left="4668" w:hanging="360"/>
+      </w:pPr>
+      <w:rPr>
+        <w:rFonts w:ascii="Wingdings" w:hAnsi="Wingdings" w:hint="default"/>
+      </w:rPr>
+    </w:lvl>
+    <w:lvl w:ilvl="6" w:tplc="080A0001" w:tentative="1">
+      <w:start w:val="1"/>
+      <w:numFmt w:val="bullet"/>
+      <w:lvlText w:val=""/>
+      <w:lvlJc w:val="left"/>
+      <w:pPr>
+        <w:ind w:left="5388" w:hanging="360"/>
+      </w:pPr>
+      <w:rPr>
+        <w:rFonts w:ascii="Symbol" w:hAnsi="Symbol" w:hint="default"/>
+      </w:rPr>
+    </w:lvl>
+    <w:lvl w:ilvl="7" w:tplc="080A0003" w:tentative="1">
+      <w:start w:val="1"/>
+      <w:numFmt w:val="bullet"/>
+      <w:lvlText w:val="o"/>
+      <w:lvlJc w:val="left"/>
+      <w:pPr>
+        <w:ind w:left="6108" w:hanging="360"/>
+      </w:pPr>
+      <w:rPr>
+        <w:rFonts w:ascii="Courier New" w:hAnsi="Courier New" w:cs="Courier New" w:hint="default"/>
+      </w:rPr>
+    </w:lvl>
+    <w:lvl w:ilvl="8" w:tplc="080A0005" w:tentative="1">
+      <w:start w:val="1"/>
+      <w:numFmt w:val="bullet"/>
+      <w:lvlText w:val=""/>
+      <w:lvlJc w:val="left"/>
+      <w:pPr>
+        <w:ind w:left="6828" w:hanging="360"/>
+      </w:pPr>
+      <w:rPr>
+        <w:rFonts w:ascii="Wingdings" w:hAnsi="Wingdings" w:hint="default"/>
+      </w:rPr>
+    </w:lvl>
+  </w:abstractNum>
+  <w:abstractNum w:abstractNumId="4" w15:restartNumberingAfterBreak="0">
     <w:nsid w:val="25D101E3"/>
     <w:multiLevelType w:val="hybridMultilevel"/>
     <w:tmpl w:val="1E9CC514"/>
@@ -4836,7 +6372,7 @@
       </w:rPr>
     </w:lvl>
   </w:abstractNum>
-  <w:abstractNum w:abstractNumId="4" w15:restartNumberingAfterBreak="0">
+  <w:abstractNum w:abstractNumId="5" w15:restartNumberingAfterBreak="0">
     <w:nsid w:val="26DE4B16"/>
     <w:multiLevelType w:val="multilevel"/>
     <w:tmpl w:val="9470283E"/>
@@ -4985,7 +6521,120 @@
       </w:rPr>
     </w:lvl>
   </w:abstractNum>
-  <w:abstractNum w:abstractNumId="5" w15:restartNumberingAfterBreak="0">
+  <w:abstractNum w:abstractNumId="6" w15:restartNumberingAfterBreak="0">
+    <w:nsid w:val="293B6CDD"/>
+    <w:multiLevelType w:val="hybridMultilevel"/>
+    <w:tmpl w:val="3BB635EA"/>
+    <w:lvl w:ilvl="0" w:tplc="080A0001">
+      <w:start w:val="1"/>
+      <w:numFmt w:val="bullet"/>
+      <w:lvlText w:val=""/>
+      <w:lvlJc w:val="left"/>
+      <w:pPr>
+        <w:ind w:left="720" w:hanging="360"/>
+      </w:pPr>
+      <w:rPr>
+        <w:rFonts w:ascii="Symbol" w:hAnsi="Symbol" w:hint="default"/>
+      </w:rPr>
+    </w:lvl>
+    <w:lvl w:ilvl="1" w:tplc="080A0003" w:tentative="1">
+      <w:start w:val="1"/>
+      <w:numFmt w:val="bullet"/>
+      <w:lvlText w:val="o"/>
+      <w:lvlJc w:val="left"/>
+      <w:pPr>
+        <w:ind w:left="1440" w:hanging="360"/>
+      </w:pPr>
+      <w:rPr>
+        <w:rFonts w:ascii="Courier New" w:hAnsi="Courier New" w:cs="Courier New" w:hint="default"/>
+      </w:rPr>
+    </w:lvl>
+    <w:lvl w:ilvl="2" w:tplc="080A0005" w:tentative="1">
+      <w:start w:val="1"/>
+      <w:numFmt w:val="bullet"/>
+      <w:lvlText w:val=""/>
+      <w:lvlJc w:val="left"/>
+      <w:pPr>
+        <w:ind w:left="2160" w:hanging="360"/>
+      </w:pPr>
+      <w:rPr>
+        <w:rFonts w:ascii="Wingdings" w:hAnsi="Wingdings" w:hint="default"/>
+      </w:rPr>
+    </w:lvl>
+    <w:lvl w:ilvl="3" w:tplc="080A0001" w:tentative="1">
+      <w:start w:val="1"/>
+      <w:numFmt w:val="bullet"/>
+      <w:lvlText w:val=""/>
+      <w:lvlJc w:val="left"/>
+      <w:pPr>
+        <w:ind w:left="2880" w:hanging="360"/>
+      </w:pPr>
+      <w:rPr>
+        <w:rFonts w:ascii="Symbol" w:hAnsi="Symbol" w:hint="default"/>
+      </w:rPr>
+    </w:lvl>
+    <w:lvl w:ilvl="4" w:tplc="080A0003" w:tentative="1">
+      <w:start w:val="1"/>
+      <w:numFmt w:val="bullet"/>
+      <w:lvlText w:val="o"/>
+      <w:lvlJc w:val="left"/>
+      <w:pPr>
+        <w:ind w:left="3600" w:hanging="360"/>
+      </w:pPr>
+      <w:rPr>
+        <w:rFonts w:ascii="Courier New" w:hAnsi="Courier New" w:cs="Courier New" w:hint="default"/>
+      </w:rPr>
+    </w:lvl>
+    <w:lvl w:ilvl="5" w:tplc="080A0005" w:tentative="1">
+      <w:start w:val="1"/>
+      <w:numFmt w:val="bullet"/>
+      <w:lvlText w:val=""/>
+      <w:lvlJc w:val="left"/>
+      <w:pPr>
+        <w:ind w:left="4320" w:hanging="360"/>
+      </w:pPr>
+      <w:rPr>
+        <w:rFonts w:ascii="Wingdings" w:hAnsi="Wingdings" w:hint="default"/>
+      </w:rPr>
+    </w:lvl>
+    <w:lvl w:ilvl="6" w:tplc="080A0001" w:tentative="1">
+      <w:start w:val="1"/>
+      <w:numFmt w:val="bullet"/>
+      <w:lvlText w:val=""/>
+      <w:lvlJc w:val="left"/>
+      <w:pPr>
+        <w:ind w:left="5040" w:hanging="360"/>
+      </w:pPr>
+      <w:rPr>
+        <w:rFonts w:ascii="Symbol" w:hAnsi="Symbol" w:hint="default"/>
+      </w:rPr>
+    </w:lvl>
+    <w:lvl w:ilvl="7" w:tplc="080A0003" w:tentative="1">
+      <w:start w:val="1"/>
+      <w:numFmt w:val="bullet"/>
+      <w:lvlText w:val="o"/>
+      <w:lvlJc w:val="left"/>
+      <w:pPr>
+        <w:ind w:left="5760" w:hanging="360"/>
+      </w:pPr>
+      <w:rPr>
+        <w:rFonts w:ascii="Courier New" w:hAnsi="Courier New" w:cs="Courier New" w:hint="default"/>
+      </w:rPr>
+    </w:lvl>
+    <w:lvl w:ilvl="8" w:tplc="080A0005" w:tentative="1">
+      <w:start w:val="1"/>
+      <w:numFmt w:val="bullet"/>
+      <w:lvlText w:val=""/>
+      <w:lvlJc w:val="left"/>
+      <w:pPr>
+        <w:ind w:left="6480" w:hanging="360"/>
+      </w:pPr>
+      <w:rPr>
+        <w:rFonts w:ascii="Wingdings" w:hAnsi="Wingdings" w:hint="default"/>
+      </w:rPr>
+    </w:lvl>
+  </w:abstractNum>
+  <w:abstractNum w:abstractNumId="7" w15:restartNumberingAfterBreak="0">
     <w:nsid w:val="2A7161BC"/>
     <w:multiLevelType w:val="hybridMultilevel"/>
     <w:tmpl w:val="7B5AAC52"/>
@@ -5098,7 +6747,7 @@
       </w:rPr>
     </w:lvl>
   </w:abstractNum>
-  <w:abstractNum w:abstractNumId="6" w15:restartNumberingAfterBreak="0">
+  <w:abstractNum w:abstractNumId="8" w15:restartNumberingAfterBreak="0">
     <w:nsid w:val="2E8C7B01"/>
     <w:multiLevelType w:val="multilevel"/>
     <w:tmpl w:val="C17EACDC"/>
@@ -5219,7 +6868,7 @@
       </w:rPr>
     </w:lvl>
   </w:abstractNum>
-  <w:abstractNum w:abstractNumId="7" w15:restartNumberingAfterBreak="0">
+  <w:abstractNum w:abstractNumId="9" w15:restartNumberingAfterBreak="0">
     <w:nsid w:val="40DD1A90"/>
     <w:multiLevelType w:val="multilevel"/>
     <w:tmpl w:val="6E5C174A"/>
@@ -5332,7 +6981,7 @@
       </w:rPr>
     </w:lvl>
   </w:abstractNum>
-  <w:abstractNum w:abstractNumId="8" w15:restartNumberingAfterBreak="0">
+  <w:abstractNum w:abstractNumId="10" w15:restartNumberingAfterBreak="0">
     <w:nsid w:val="43722CF5"/>
     <w:multiLevelType w:val="hybridMultilevel"/>
     <w:tmpl w:val="7CCAC0E6"/>
@@ -5418,7 +7067,7 @@
       </w:pPr>
     </w:lvl>
   </w:abstractNum>
-  <w:abstractNum w:abstractNumId="9" w15:restartNumberingAfterBreak="0">
+  <w:abstractNum w:abstractNumId="11" w15:restartNumberingAfterBreak="0">
     <w:nsid w:val="4D4940A8"/>
     <w:multiLevelType w:val="hybridMultilevel"/>
     <w:tmpl w:val="4FEC69F0"/>
@@ -5532,7 +7181,7 @@
       </w:rPr>
     </w:lvl>
   </w:abstractNum>
-  <w:abstractNum w:abstractNumId="10" w15:restartNumberingAfterBreak="0">
+  <w:abstractNum w:abstractNumId="12" w15:restartNumberingAfterBreak="0">
     <w:nsid w:val="4F397A1C"/>
     <w:multiLevelType w:val="multilevel"/>
     <w:tmpl w:val="CCDA827E"/>
@@ -5681,7 +7330,7 @@
       </w:rPr>
     </w:lvl>
   </w:abstractNum>
-  <w:abstractNum w:abstractNumId="11" w15:restartNumberingAfterBreak="0">
+  <w:abstractNum w:abstractNumId="13" w15:restartNumberingAfterBreak="0">
     <w:nsid w:val="54174C12"/>
     <w:multiLevelType w:val="multilevel"/>
     <w:tmpl w:val="15B62650"/>
@@ -5812,7 +7461,7 @@
       </w:rPr>
     </w:lvl>
   </w:abstractNum>
-  <w:abstractNum w:abstractNumId="12" w15:restartNumberingAfterBreak="0">
+  <w:abstractNum w:abstractNumId="14" w15:restartNumberingAfterBreak="0">
     <w:nsid w:val="54517D06"/>
     <w:multiLevelType w:val="hybridMultilevel"/>
     <w:tmpl w:val="3DB0EB80"/>
@@ -5924,7 +7573,7 @@
       </w:rPr>
     </w:lvl>
   </w:abstractNum>
-  <w:abstractNum w:abstractNumId="13" w15:restartNumberingAfterBreak="0">
+  <w:abstractNum w:abstractNumId="15" w15:restartNumberingAfterBreak="0">
     <w:nsid w:val="68E15795"/>
     <w:multiLevelType w:val="hybridMultilevel"/>
     <w:tmpl w:val="8FE616A0"/>
@@ -6037,7 +7686,7 @@
       </w:rPr>
     </w:lvl>
   </w:abstractNum>
-  <w:abstractNum w:abstractNumId="14" w15:restartNumberingAfterBreak="0">
+  <w:abstractNum w:abstractNumId="16" w15:restartNumberingAfterBreak="0">
     <w:nsid w:val="6AFC07D3"/>
     <w:multiLevelType w:val="multilevel"/>
     <w:tmpl w:val="B3426C00"/>
@@ -6150,7 +7799,7 @@
       </w:rPr>
     </w:lvl>
   </w:abstractNum>
-  <w:abstractNum w:abstractNumId="15" w15:restartNumberingAfterBreak="0">
+  <w:abstractNum w:abstractNumId="17" w15:restartNumberingAfterBreak="0">
     <w:nsid w:val="6B7B1E92"/>
     <w:multiLevelType w:val="multilevel"/>
     <w:tmpl w:val="21BA233E"/>
@@ -6281,7 +7930,7 @@
       </w:rPr>
     </w:lvl>
   </w:abstractNum>
-  <w:abstractNum w:abstractNumId="16" w15:restartNumberingAfterBreak="0">
+  <w:abstractNum w:abstractNumId="18" w15:restartNumberingAfterBreak="0">
     <w:nsid w:val="6FA144D3"/>
     <w:multiLevelType w:val="multilevel"/>
     <w:tmpl w:val="98CEB7D6"/>
@@ -6402,7 +8051,7 @@
       </w:rPr>
     </w:lvl>
   </w:abstractNum>
-  <w:abstractNum w:abstractNumId="17" w15:restartNumberingAfterBreak="0">
+  <w:abstractNum w:abstractNumId="19" w15:restartNumberingAfterBreak="0">
     <w:nsid w:val="738344F2"/>
     <w:multiLevelType w:val="hybridMultilevel"/>
     <w:tmpl w:val="C4E037F2"/>
@@ -6517,7 +8166,7 @@
       </w:rPr>
     </w:lvl>
   </w:abstractNum>
-  <w:abstractNum w:abstractNumId="18" w15:restartNumberingAfterBreak="0">
+  <w:abstractNum w:abstractNumId="20" w15:restartNumberingAfterBreak="0">
     <w:nsid w:val="73AB37C1"/>
     <w:multiLevelType w:val="hybridMultilevel"/>
     <w:tmpl w:val="B166231C"/>
@@ -6606,7 +8255,7 @@
       </w:pPr>
     </w:lvl>
   </w:abstractNum>
-  <w:abstractNum w:abstractNumId="19" w15:restartNumberingAfterBreak="0">
+  <w:abstractNum w:abstractNumId="21" w15:restartNumberingAfterBreak="0">
     <w:nsid w:val="74B1685F"/>
     <w:multiLevelType w:val="hybridMultilevel"/>
     <w:tmpl w:val="943E89B2"/>
@@ -6719,7 +8368,7 @@
       </w:rPr>
     </w:lvl>
   </w:abstractNum>
-  <w:abstractNum w:abstractNumId="20" w15:restartNumberingAfterBreak="0">
+  <w:abstractNum w:abstractNumId="22" w15:restartNumberingAfterBreak="0">
     <w:nsid w:val="75DB1EAD"/>
     <w:multiLevelType w:val="multilevel"/>
     <w:tmpl w:val="F2B0D608"/>
@@ -6832,7 +8481,7 @@
       </w:rPr>
     </w:lvl>
   </w:abstractNum>
-  <w:abstractNum w:abstractNumId="21" w15:restartNumberingAfterBreak="0">
+  <w:abstractNum w:abstractNumId="23" w15:restartNumberingAfterBreak="0">
     <w:nsid w:val="77694BC3"/>
     <w:multiLevelType w:val="hybridMultilevel"/>
     <w:tmpl w:val="8D0A3582"/>
@@ -6945,7 +8594,7 @@
       </w:rPr>
     </w:lvl>
   </w:abstractNum>
-  <w:abstractNum w:abstractNumId="22" w15:restartNumberingAfterBreak="0">
+  <w:abstractNum w:abstractNumId="24" w15:restartNumberingAfterBreak="0">
     <w:nsid w:val="7CE94054"/>
     <w:multiLevelType w:val="multilevel"/>
     <w:tmpl w:val="A4D4C1F2"/>
@@ -7060,73 +8709,79 @@
     </w:lvl>
   </w:abstractNum>
   <w:num w:numId="1">
-    <w:abstractNumId w:val="7"/>
+    <w:abstractNumId w:val="9"/>
   </w:num>
   <w:num w:numId="2">
+    <w:abstractNumId w:val="19"/>
+  </w:num>
+  <w:num w:numId="3">
+    <w:abstractNumId w:val="18"/>
+  </w:num>
+  <w:num w:numId="4">
+    <w:abstractNumId w:val="16"/>
+  </w:num>
+  <w:num w:numId="5">
+    <w:abstractNumId w:val="24"/>
+  </w:num>
+  <w:num w:numId="6">
+    <w:abstractNumId w:val="13"/>
+  </w:num>
+  <w:num w:numId="7">
     <w:abstractNumId w:val="17"/>
   </w:num>
-  <w:num w:numId="3">
-    <w:abstractNumId w:val="16"/>
-  </w:num>
-  <w:num w:numId="4">
-    <w:abstractNumId w:val="14"/>
-  </w:num>
-  <w:num w:numId="5">
+  <w:num w:numId="8">
     <w:abstractNumId w:val="22"/>
   </w:num>
-  <w:num w:numId="6">
-    <w:abstractNumId w:val="11"/>
-  </w:num>
-  <w:num w:numId="7">
-    <w:abstractNumId w:val="15"/>
-  </w:num>
-  <w:num w:numId="8">
-    <w:abstractNumId w:val="20"/>
-  </w:num>
   <w:num w:numId="9">
-    <w:abstractNumId w:val="21"/>
+    <w:abstractNumId w:val="23"/>
   </w:num>
   <w:num w:numId="10">
     <w:abstractNumId w:val="1"/>
   </w:num>
   <w:num w:numId="11">
-    <w:abstractNumId w:val="3"/>
+    <w:abstractNumId w:val="4"/>
   </w:num>
   <w:num w:numId="12">
-    <w:abstractNumId w:val="12"/>
+    <w:abstractNumId w:val="14"/>
   </w:num>
   <w:num w:numId="13">
-    <w:abstractNumId w:val="6"/>
+    <w:abstractNumId w:val="8"/>
   </w:num>
   <w:num w:numId="14">
-    <w:abstractNumId w:val="9"/>
+    <w:abstractNumId w:val="11"/>
   </w:num>
   <w:num w:numId="15">
     <w:abstractNumId w:val="0"/>
   </w:num>
   <w:num w:numId="16">
-    <w:abstractNumId w:val="19"/>
+    <w:abstractNumId w:val="21"/>
   </w:num>
   <w:num w:numId="17">
-    <w:abstractNumId w:val="13"/>
+    <w:abstractNumId w:val="15"/>
   </w:num>
   <w:num w:numId="18">
     <w:abstractNumId w:val="2"/>
   </w:num>
   <w:num w:numId="19">
+    <w:abstractNumId w:val="12"/>
+  </w:num>
+  <w:num w:numId="20">
+    <w:abstractNumId w:val="5"/>
+  </w:num>
+  <w:num w:numId="21">
     <w:abstractNumId w:val="10"/>
   </w:num>
-  <w:num w:numId="20">
-    <w:abstractNumId w:val="4"/>
-  </w:num>
-  <w:num w:numId="21">
-    <w:abstractNumId w:val="8"/>
-  </w:num>
   <w:num w:numId="22">
-    <w:abstractNumId w:val="18"/>
+    <w:abstractNumId w:val="20"/>
   </w:num>
   <w:num w:numId="23">
-    <w:abstractNumId w:val="5"/>
+    <w:abstractNumId w:val="7"/>
+  </w:num>
+  <w:num w:numId="24">
+    <w:abstractNumId w:val="6"/>
+  </w:num>
+  <w:num w:numId="25">
+    <w:abstractNumId w:val="3"/>
   </w:num>
 </w:numbering>
 </file>
@@ -7254,6 +8909,7 @@
     <w:lsdException w:name="HTML Sample" w:semiHidden="1" w:unhideWhenUsed="1"/>
     <w:lsdException w:name="HTML Typewriter" w:semiHidden="1" w:unhideWhenUsed="1"/>
     <w:lsdException w:name="HTML Variable" w:semiHidden="1" w:unhideWhenUsed="1"/>
+    <w:lsdException w:name="Normal Table" w:semiHidden="1" w:unhideWhenUsed="1"/>
     <w:lsdException w:name="annotation subject" w:semiHidden="1" w:unhideWhenUsed="1"/>
     <w:lsdException w:name="No List" w:semiHidden="1" w:unhideWhenUsed="1"/>
     <w:lsdException w:name="Outline List 1" w:semiHidden="1" w:unhideWhenUsed="1"/>
@@ -7300,8 +8956,10 @@
     <w:lsdException w:name="Table Subtle 2" w:semiHidden="1" w:unhideWhenUsed="1"/>
     <w:lsdException w:name="Table Web 1" w:semiHidden="1" w:unhideWhenUsed="1"/>
     <w:lsdException w:name="Table Web 2" w:semiHidden="1" w:unhideWhenUsed="1"/>
+    <w:lsdException w:name="Table Web 3" w:semiHidden="1" w:unhideWhenUsed="1"/>
     <w:lsdException w:name="Balloon Text" w:semiHidden="1" w:unhideWhenUsed="1"/>
     <w:lsdException w:name="Table Grid" w:uiPriority="39"/>
+    <w:lsdException w:name="Table Theme" w:semiHidden="1" w:unhideWhenUsed="1"/>
     <w:lsdException w:name="Placeholder Text" w:semiHidden="1"/>
     <w:lsdException w:name="No Spacing" w:uiPriority="1" w:qFormat="1"/>
     <w:lsdException w:name="Light Shading" w:uiPriority="60"/>
@@ -8153,6 +9811,18 @@
       </w:rPr>
     </w:tblStylePr>
   </w:style>
+  <w:style w:type="character" w:styleId="Mencinsinresolver">
+    <w:name w:val="Unresolved Mention"/>
+    <w:basedOn w:val="Fuentedeprrafopredeter"/>
+    <w:uiPriority w:val="99"/>
+    <w:semiHidden/>
+    <w:unhideWhenUsed/>
+    <w:rsid w:val="002220E3"/>
+    <w:rPr>
+      <w:color w:val="605E5C"/>
+      <w:shd w:val="clear" w:color="auto" w:fill="E1DFDD"/>
+    </w:rPr>
+  </w:style>
 </w:styles>
 </file>
 

</xml_diff>